<commit_message>
Final code and thesis book after the examination (22 Oct 2569)
Snapshot of the finished project for the committee: the อำพร OMS system in soml/ with the post-exam work (credit sales, cash payment, daily sales report, payment badges on the queue, Docker setup, receipt short names, PromptPay checks, client IP in the audit log, SSE fallback, 44 px queue buttons) and the final thesis book in Documents/ and เอกสารแต่ละบท/.

One commit on top of main so the repository holds the final version without the earlier local history. The shop's stock file, environment files and photos showing store staff are left out.

Co-Authored-By: Claude Opus 5.5 <noreply@anthropic.com>
</commit_message>
<xml_diff>
--- a/Documents/รูปเล่ม/บทที่1_ฉบับตรวจแก้.docx
+++ b/Documents/รูปเล่ม/บทที่1_ฉบับตรวจแก้.docx
@@ -2,7 +2,7 @@
 <file path=word/document.xml><?xml version="1.0" encoding="utf-8"?>
 <w:document xmlns:w="http://schemas.openxmlformats.org/wordprocessingml/2006/main" xmlns:m="http://schemas.openxmlformats.org/officeDocument/2006/math" xmlns:r="http://schemas.openxmlformats.org/officeDocument/2006/relationships" xmlns:o="urn:schemas-microsoft-com:office:office" xmlns:v="urn:schemas-microsoft-com:vml" xmlns:w10="urn:schemas-microsoft-com:office:word" xmlns:a="http://schemas.openxmlformats.org/drawingml/2006/main" xmlns:pic="http://schemas.openxmlformats.org/drawingml/2006/picture" xmlns:wp="http://schemas.openxmlformats.org/drawingml/2006/wordprocessingDrawing">
   <w:body>
-    <w:bookmarkStart w:id="23" w:name="บทท-1"/>
+    <w:bookmarkStart w:id="24" w:name="บทท-1"/>
     <w:p>
       <w:pPr>
         <w:pStyle w:val="Heading1"/>
@@ -21,13 +21,13 @@
       </w:r>
     </w:p>
     <w:bookmarkEnd w:id="9"/>
-    <w:bookmarkStart w:id="10" w:name="ทมาและความสำคญ"/>
+    <w:bookmarkStart w:id="10" w:name="X0047bf461bb0b62207697fdc9ea5df4b185675d"/>
     <w:p>
       <w:pPr>
         <w:pStyle w:val="Heading2"/>
       </w:pPr>
       <w:r>
-        <w:t xml:space="preserve">1.1 ที่มาและความสำคัญ</w:t>
+        <w:t xml:space="preserve">1.1 ความเป็นมาและความสำคัญของปัญหา (Background and Problem Statement)</w:t>
       </w:r>
     </w:p>
     <w:p>
@@ -35,7 +35,7 @@
         <w:pStyle w:val="FirstParagraph"/>
       </w:pPr>
       <w:r>
-        <w:t xml:space="preserve">ในปัจจุบัน ธุรกิจค้าปลีกวัสดุก่อสร้างขนาดกลางและขนาดเล็กยังคงประสบปัญหาสำคัญจากการขาดระบบจัดการข้อมูลที่เป็นดิจิทัลและทันสมัย ซึ่งถือเป็นข้อจำกัดพื้นฐานที่ฉุดรั้งความสามารถในการแข่งขันและคุณภาพการให้บริการลูกค้าอย่างมีนัยสำคัญ ร้านจำหน่ายวัสดุก่อสร้างโดยทั่วไปยังไม่มีระบบบันทึกการขายหรือระบบจัดการสต็อกที่เชื่อมโยงกัน พนักงานขายต้องพึ่งพาใบเสร็จและบิลกระดาษในการบันทึกรายการสินค้าและยอดชำระเงิน ซึ่งเป็นกระบวนการที่ไม่มีการยืนยันโดยระบบ ทำให้ข้อมูลรายการขายกระจัดกระจาย ตรวจสอบย้อนหลังได้ยาก และเสี่ยงต่อการสูญหายหรือถูกปลอมแปลงได้</w:t>
+        <w:t xml:space="preserve">ในปัจจุบัน ธุรกิจค้าปลีกวัสดุก่อสร้างขนาดกลางและขนาดเล็กยังคงประสบปัญหาสำคัญจากการขาดระบบจัดการข้อมูลที่เป็นดิจิทัล ร้านจำหน่ายวัสดุก่อสร้างโดยทั่วไปยังไม่มีระบบบันทึกการขายหรือระบบจัดการสต็อกที่เชื่อมโยงกัน พนักงานขายต้องพึ่งพาใบเสร็จและบิลกระดาษในการบันทึกรายการสินค้าและยอดชำระเงิน ซึ่งเป็นกระบวนการที่ไม่มีการยืนยันโดยระบบ ทำให้ข้อมูลรายการขายกระจัดกระจาย ตรวจสอบย้อนหลังได้ยาก และเสี่ยงต่อการสูญหายหรือถูกปลอมแปลงได้</w:t>
       </w:r>
     </w:p>
     <w:p>
@@ -43,7 +43,7 @@
         <w:pStyle w:val="BodyText"/>
       </w:pPr>
       <w:r>
-        <w:t xml:space="preserve">เมื่อไม่มีระบบขายและสต็อกที่เป็นเอกภาพ ปัญหาต่อเนื่องที่ตามมาคือกระบวนการเบิกจ่ายวัสดุที่จุดคลังสินค้า เนื่องจากจุดชำระเงินหน้าร้านและจุดรับของที่โกดังตั้งอยู่คนละพื้นที่กัน แต่ทั้งสองจุดไม่มีช่องทางสื่อสารกันแบบเรียลไทม์</w:t>
+        <w:t xml:space="preserve">ร้านวัสดุก่อสร้างอำพรคอนกรีตซึ่งเป็นกรณีศึกษาของโครงงานนี้มีลักษณะดังกล่าว จุดชำระเงินหน้าร้านและจุดรับของที่โกดังตั้งอยู่คนละพื้นที่ แต่ทั้งสองจุดไม่มีช่องทางสื่อสารกันแบบเรียลไทม์ พนักงานคลังสินค้าจึงไม่ทราบล่วงหน้าว่ามีคำสั่งซื้อใดรอการจัดเตรียมอยู่ ลูกค้าต้องนำใบเสร็จกระดาษเดินไปที่โกดังด้วยตนเองแล้วพนักงานจึงเริ่มจัดของ ส่งผลให้เกิดคอขวดและการรอคอยที่ยาวนานในชั่วโมงเร่งด่วน เมื่อพนักงานคลังต้องอ่านใบเสร็จกระดาษเพื่อจัดของ โอกาสที่จะหยิบสินค้าผิดประเภท ผิดจำนวน หรือมีการนำบิลเก่ามาใช้รับของซ้ำย่อมมีสูง ปัญหาเหล่านี้ทำให้ยอดสต็อกคลาดเคลื่อนจากความเป็นจริง และผู้จัดการต้องรอสรุปยอดขายและนับสต็อกด้วยมือตอนท้ายวัน การตัดสินใจสั่งซื้อสินค้าจึงต้องพึ่งประสบการณ์แทนข้อมูลจริง</w:t>
       </w:r>
     </w:p>
     <w:p>
@@ -51,7 +51,7 @@
         <w:pStyle w:val="BodyText"/>
       </w:pPr>
       <w:r>
-        <w:t xml:space="preserve">พนักงานคลังสินค้าจึงไม่สามารถทราบล่วงหน้าว่ามีคำสั่งซื้อใดรอการจัดเตรียมอยู่บ้าง ลูกค้าต้องนำใบเสร็จกระดาษเดินเข้าไปหาโกดังด้วยตนเอง แล้วพนักงานจึงค่อยเริ่มจัดของ ส่งผลให้เกิดปัญหาคอขวดและการรอคอยที่ยาวนานในชั่วโมงเร่งด่วน ยิ่งไปกว่านั้น เมื่อพนักงานคลังสินค้าต้องอ่านใบเสร็จกระดาษเพื่อจัดของ โอกาสที่จะเกิดความผิดพลาดจากสายตามนุษย์ย่อมมีสูง ไม่ว่าจะเป็นการหยิบสินค้าผิดประเภท ผิดจำนวน หรือแม้แต่การนำบิลเก่ามาใช้รับของซ้ำ ซึ่งปัญหาเหล่านี้ส่งผลโดยตรงต่อยอดสต็อกที่คลาดเคลื่อนจากความเป็นจริง ปัญหาที่สะสมมาทั้งหมดนี้นำไปสู่ความขาดแคลนทัศนวิสัยเชิงบริหาร</w:t>
+        <w:t xml:space="preserve">ผู้มีส่วนได้ส่วนเสียของปัญหานี้มีสี่กลุ่ม ได้แก่ พนักงานขายซึ่งต้องเขียนบิลและคำนวณยอดเอง พนักงานคลังสินค้าซึ่งต้องอ่านบิลกระดาษและจำเองว่าใบใดจ่ายของไปแล้ว ผู้จัดการซึ่งเป็นเจ้าของร้านและต้องการเห็นยอดขายและสต็อกระหว่างวัน และลูกค้าซึ่งไม่ได้ใช้ระบบโดยตรงแต่ได้รับผลจากเวลารอคอย ปัญหาทั้งหมดข้างต้นได้มาจากการสังเกตการณ์การทำงานจริงที่ร้าน และการสอบถามเจ้าของร้านและพนักงาน โดยสรุปเป็นหลักฐานจากหน้างานเก้าข้อที่มีรหัสกำกับไว้ในบทที่ 3 หัวข้อ 3.2.1</w:t>
       </w:r>
     </w:p>
     <w:p>
@@ -59,409 +59,127 @@
         <w:pStyle w:val="BodyText"/>
       </w:pPr>
       <w:r>
-        <w:t xml:space="preserve">ผู้จัดการต้องรอสรุปยอดขายและนับสต็อกด้วยมือในตอนท้ายวัน ทำให้ไม่สามารถมองเห็นสถานการณ์แบบเรียลไทม์ และการตัดสินใจสั่งซื้อสินค้าก็ต้องพึ่งประสบการณ์และสัญชาตญาณเพียงอย่างเดียว แทนที่จะใช้ข้อมูลเชิงสถิติที่ถูกต้องและทันสมัย</w:t>
+        <w:t xml:space="preserve">จากปัญหาข้างต้น คณะผู้จัดทำจึงออกแบบและพัฒนาระบบจัดการคำสั่งซื้อและตรวจสอบคลังสินค้า (อำพร OMS) กรณีศึกษา ร้านวัสดุก่อสร้างอำพรคอนกรีต เพื่อเชื่อมกระบวนการหน้าร้านและคลังสินค้าเข้าด้วยกัน ลดข้อผิดพลาดจากกระบวนการกระดาษ ลดระยะเวลารอคอยของลูกค้า และเพิ่มทัศนวิสัยในการบริหารจัดการ ปัญหานี้ควรแก้ด้วยการพัฒนาซอฟต์แวร์ เพราะต้นเหตุคือข้อมูลที่ไม่ไหลระหว่างสองจุดและไม่มีสิ่งใดกันการทำรายการซ้ำ ซึ่งเป็นสิ่งที่ระบบซอฟต์แวร์ควบคุมได้โดยตรง</w:t>
+      </w:r>
+    </w:p>
+    <w:bookmarkEnd w:id="10"/>
+    <w:bookmarkStart w:id="13" w:name="วตถประสงคของโครงงาน-objectives"/>
+    <w:p>
+      <w:pPr>
+        <w:pStyle w:val="Heading2"/>
+      </w:pPr>
+      <w:r>
+        <w:t xml:space="preserve">1.2 วัตถุประสงค์ของโครงงาน (Objectives)</w:t>
+      </w:r>
+    </w:p>
+    <w:p>
+      <w:pPr>
+        <w:pStyle w:val="FirstParagraph"/>
+      </w:pPr>
+      <w:r>
+        <w:t xml:space="preserve">วัตถุประสงค์แบ่งเป็นสองกลุ่ม คือวัตถุประสงค์เชิงผลิตภัณฑ์ซึ่งระบุว่าระบบต้องทำอะไรได้ และวัตถุประสงค์เชิงการเรียนรู้ซึ่งระบุว่าผู้จัดทำต้องได้ฝึกทักษะใด ทุกข้อมีเกณฑ์ที่วัดผลได้ และต้องบรรลุภายในระยะเวลาโครงงาน 6 เดือนตามหัวข้อ 1.5 เพื่อใช้สรุปผลในบทที่ 5</w:t>
+      </w:r>
+    </w:p>
+    <w:bookmarkStart w:id="11" w:name="วตถประสงคเชงผลตภณฑ-product-objectives"/>
+    <w:p>
+      <w:pPr>
+        <w:pStyle w:val="Heading3"/>
+      </w:pPr>
+      <w:r>
+        <w:t xml:space="preserve">1.2.1 วัตถุประสงค์เชิงผลิตภัณฑ์ (Product Objectives)</w:t>
+      </w:r>
+    </w:p>
+    <w:p>
+      <w:pPr>
+        <w:pStyle w:val="FirstParagraph"/>
+        <w:ind w:firstLine="1267"/>
+      </w:pPr>
+      <w:r>
+        <w:t xml:space="preserve">ข้อ 1 เพื่อลดข้อผิดพลาดในการบันทึกการขายและจัดการสินค้าคงคลังที่เกิดจากเอกสารกระดาษ โดยยอดเงินทุกคำสั่งซื้อต้องคำนวณโดยระบบและตรงกับการคำนวณด้วยมือ และทุกการทำรายการสำคัญต้องมีประวัติที่ค้นย้อนหลังได้</w:t>
       </w:r>
     </w:p>
     <w:p>
       <w:pPr>
         <w:pStyle w:val="BodyText"/>
-      </w:pPr>
-      <w:r>
-        <w:t xml:space="preserve">จากปัญหาข้างต้น คณะผู้จัดทำในฐานะที่มีความเกี่ยวข้องกับธุรกิจประเภทนี้โดยตรง จึงมีวัตถุประสงค์เพื่อออกแบบและพัฒนา</w:t>
-      </w:r>
-      <w:r>
-        <w:t xml:space="preserve"> </w:t>
-      </w:r>
-      <w:r>
-        <w:rPr>
-          <w:b/>
-          <w:bCs/>
-        </w:rPr>
-        <w:t xml:space="preserve">ระบบจัดการคำสั่งซื้อและตรวจสอบคลังสินค้า (Order Management and Inventory Control System: SOML)</w:t>
-      </w:r>
-      <w:r>
-        <w:t xml:space="preserve"> </w:t>
-      </w:r>
-      <w:r>
-        <w:t xml:space="preserve">กรณีศึกษา ร้านวัสดุก่อสร้างอำพรคอนกรีต โดยประยุกต์ใช้สถาปัตยกรรมระบบแบบ 3 ชั้น (3-Tier Architecture) ร่วมกับการสื่อสารข้อมูลแบบขับเคลื่อนด้วยเหตุการณ์ (Event-Driven Communication) เพื่อเชื่อมโยงกระบวนการหน้าร้านและคลังสินค้าเข้าด้วยกัน ลดข้อผิดพลาดจากกระบวนการกระดาษ ลดระยะเวลารอคอยของลูกค้า และเพิ่มทัศนวิสัยในการบริหารจัดการด้วยแดชบอร์ดปฏิบัติการ เพื่อยกระดับความสามารถในการแข่งขันของธุรกิจค้าปลีกวัสดุก่อสร้างขนาดกลางและขนาดเล็กให้สามารถดำเนินงานได้อย่างมีประสิทธิภาพและยั่งยืน</w:t>
-      </w:r>
-    </w:p>
-    <w:bookmarkEnd w:id="10"/>
-    <w:bookmarkStart w:id="11" w:name="วตถประสงคของโครงงานวศวกรรม"/>
+        <w:ind w:firstLine="1267"/>
+      </w:pPr>
+      <w:r>
+        <w:t xml:space="preserve">ข้อ 2 เพื่อลดระยะเวลารอคอยของลูกค้า โดยคำสั่งซื้อที่ชำระเงินแล้วต้องปรากฏบนหน้าจอคลังสินค้าภายใน 3 วินาที พนักงานคลังจึงเริ่มจัดของได้ก่อนลูกค้าเดินมาถึงจุดรับของ</w:t>
+      </w:r>
+    </w:p>
+    <w:p>
+      <w:pPr>
+        <w:pStyle w:val="BodyText"/>
+        <w:ind w:firstLine="1267"/>
+      </w:pPr>
+      <w:r>
+        <w:t xml:space="preserve">ข้อ 3 เพื่อให้ยอดสินค้าคงเหลือในระบบสะท้อนจำนวนสินค้าจริงในคลัง โดยคำสั่งซื้อหนึ่งใบต้องจ่ายสินค้าได้เพียงครั้งเดียวแม้มีผู้กดยืนยันพร้อมกัน และยอดคงเหลือต้องไม่ติดลบ</w:t>
+      </w:r>
+    </w:p>
+    <w:p>
+      <w:pPr>
+        <w:pStyle w:val="BodyText"/>
+        <w:ind w:firstLine="1267"/>
+      </w:pPr>
+      <w:r>
+        <w:t xml:space="preserve">ข้อ 4 เพื่อให้ผู้บริหารติดตามยอดขาย สต็อก และคิวงานได้แบบเรียลไทม์ โดยตัวเลขบนแดชบอร์ดต้องตรงกับผลรวมที่คำนวณจากฐานข้อมูล และระบบต้องแจ้งเตือนเองเมื่อสินค้าต่ำกว่าจุดสั่งซื้อเพิ่ม</w:t>
+      </w:r>
+    </w:p>
+    <w:bookmarkEnd w:id="11"/>
+    <w:bookmarkStart w:id="12" w:name="วตถประสงคเชงการเรยนร-learning-objectives"/>
+    <w:p>
+      <w:pPr>
+        <w:pStyle w:val="Heading3"/>
+      </w:pPr>
+      <w:r>
+        <w:t xml:space="preserve">1.2.2 วัตถุประสงค์เชิงการเรียนรู้ (Learning Objectives)</w:t>
+      </w:r>
+    </w:p>
+    <w:p>
+      <w:pPr>
+        <w:pStyle w:val="FirstParagraph"/>
+        <w:ind w:firstLine="1267"/>
+      </w:pPr>
+      <w:r>
+        <w:t xml:space="preserve">ข้อ 5 เพื่อฝึกกระบวนการวิศวกรรมความต้องการตั้งแต่เก็บหลักฐานจากหน้างาน กำหนดความต้องการ ออกแบบ จนถึงทดสอบ โดยทุกความต้องการสอบกลับไปหาที่มาและไปข้างหน้าถึงผลการทดสอบได้ครบ</w:t>
+      </w:r>
+    </w:p>
+    <w:p>
+      <w:pPr>
+        <w:pStyle w:val="BodyText"/>
+        <w:ind w:firstLine="1267"/>
+      </w:pPr>
+      <w:r>
+        <w:t xml:space="preserve">ข้อ 6 เพื่อฝึกออกแบบและพัฒนาระบบที่มีหลายหน่วยติดตั้ง และทนต่อการทำรายการพร้อมกันของผู้ใช้หลายคน</w:t>
+      </w:r>
+    </w:p>
+    <w:bookmarkEnd w:id="12"/>
+    <w:bookmarkEnd w:id="13"/>
+    <w:bookmarkStart w:id="17" w:name="ขอบเขตของโครงงาน-project-scope"/>
     <w:p>
       <w:pPr>
         <w:pStyle w:val="Heading2"/>
       </w:pPr>
       <w:r>
-        <w:t xml:space="preserve">1.2 วัตถุประสงค์ของโครงงานวิศวกรรม</w:t>
+        <w:t xml:space="preserve">1.3 ขอบเขตของโครงงาน (Project Scope)</w:t>
+      </w:r>
+    </w:p>
+    <w:bookmarkStart w:id="14" w:name="ขอบเขตดานหนาท-functional-scope"/>
+    <w:p>
+      <w:pPr>
+        <w:pStyle w:val="Heading3"/>
+      </w:pPr>
+      <w:r>
+        <w:t xml:space="preserve">1.3.1 ขอบเขตด้านหน้าที่ (Functional Scope)</w:t>
       </w:r>
     </w:p>
     <w:p>
       <w:pPr>
         <w:pStyle w:val="FirstParagraph"/>
-      </w:pPr>
-      <w:r>
-        <w:t xml:space="preserve">1.2.1 เพื่อลดข้อผิดพลาดในกระบวนการบันทึกการขายและจัดการสินค้าคงคลัง อันเกิดจากการพึ่งพาเอกสารกระดาษที่ไม่มีการยืนยันโดยระบบ</w:t>
-      </w:r>
-    </w:p>
-    <w:p>
-      <w:pPr>
-        <w:pStyle w:val="BodyText"/>
-      </w:pPr>
-      <w:r>
-        <w:t xml:space="preserve">1.2.2 เพื่อลดระยะเวลารอคอยของลูกค้า โดยให้พนักงานคลังสินค้าสามารถรับข้อมูลคำสั่งซื้อและเริ่มจัดเตรียมสินค้าได้ทันทีที่ชำระเงิน โดยไม่ต้องรอให้ลูกค้าเดินมาถึงจุดรับของ</w:t>
-      </w:r>
-    </w:p>
-    <w:p>
-      <w:pPr>
-        <w:pStyle w:val="BodyText"/>
-      </w:pPr>
-      <w:r>
-        <w:t xml:space="preserve">1.2.3 เพื่อให้ยอดสินค้าคงเหลือในระบบสะท้อนจำนวนสินค้าจริงในคลังได้อย่างแม่นยำ และป้องกันการรับสินค้าซ้ำด้วยการควบคุมสถานะคำสั่งซื้อผ่านระบบ</w:t>
-      </w:r>
-    </w:p>
-    <w:p>
-      <w:pPr>
-        <w:pStyle w:val="BodyText"/>
-      </w:pPr>
-      <w:r>
-        <w:t xml:space="preserve">1.2.4 เพื่อให้ผู้บริหารสามารถติดตามสถานะยอดขาย สต็อก และคิวงานได้แบบเรียลไทม์ และตัดสินใจสั่งซื้อสินค้าได้จากข้อมูลจริง แทนการใช้ประสบการณ์และสัญชาตญาณ</w:t>
-      </w:r>
-    </w:p>
-    <w:bookmarkEnd w:id="11"/>
-    <w:bookmarkStart w:id="12" w:name="ขอบเขตของโครงงานวศวกรรม"/>
-    <w:p>
-      <w:pPr>
-        <w:pStyle w:val="Heading2"/>
-      </w:pPr>
-      <w:r>
-        <w:t xml:space="preserve">1.3 ขอบเขตของโครงงานวิศวกรรม</w:t>
-      </w:r>
-    </w:p>
-    <w:p>
-      <w:pPr>
-        <w:pStyle w:val="FirstParagraph"/>
-      </w:pPr>
-      <w:r>
-        <w:t xml:space="preserve">1.3.1 พัฒนาเว็บแอปพลิเคชันรูปแบบ Responsive Design รองรับการใช้งานผ่านคอมพิวเตอร์และอุปกรณ์เคลื่อนที่ ครอบคลุมผู้ใช้งาน 3 บทบาทหลัก ได้แก่ พนักงานขาย พนักงานคลังสินค้า และผู้จัดการ</w:t>
-      </w:r>
-    </w:p>
-    <w:p>
-      <w:pPr>
-        <w:pStyle w:val="BodyText"/>
-      </w:pPr>
-      <w:r>
-        <w:t xml:space="preserve">1.3.2 พัฒนาระบบลงชื่อเข้าใช้งาน การควบคุมสิทธิ์ตามบทบาท (Role-Based Access Control: RBAC) และการจัดการข้อมูลสินค้าคงคลัง (Product Master) รวมถึงการตั้งค่าจุดสั่งซื้อเพิ่ม (Reorder Point)</w:t>
-      </w:r>
-    </w:p>
-    <w:p>
-      <w:pPr>
-        <w:pStyle w:val="BodyText"/>
-      </w:pPr>
-      <w:r>
-        <w:t xml:space="preserve">1.3.3 พัฒนาระบบรับชำระเงินผ่าน QR พร้อมเพย์ (PromptPay) และเมื่อพนักงานยืนยันรับเงินแล้ว ระบบพิมพ์ใบเสร็จกระดาษผ่านเครื่องพิมพ์ใบเสร็จความร้อน (Thermal Receipt Printer) พร้อมส่งคำสั่งซื้อเข้าคิวคลังสินค้าแบบเรียลไทม์ทันที</w:t>
-      </w:r>
-    </w:p>
-    <w:p>
-      <w:pPr>
-        <w:pStyle w:val="BodyText"/>
-      </w:pPr>
-      <w:r>
-        <w:t xml:space="preserve">1.3.4 พัฒนาระบบจัดการคลังสินค้าแบบเรียลไทม์ แสดงคิวรอจ่ายสินค้าทันทีที่ลูกค้าชำระเงิน และให้พนักงานยืนยันจ่ายสินค้าพร้อมตัดสต็อกแบบอะตอมมิก (Atomic Stock Deduction)</w:t>
-      </w:r>
-    </w:p>
-    <w:p>
-      <w:pPr>
-        <w:pStyle w:val="BodyText"/>
-      </w:pPr>
-      <w:r>
-        <w:t xml:space="preserve">1.3.5 พัฒนาแดชบอร์ดปฏิบัติการ (Operational Dashboard) แสดงสถิติยอดขายและสต็อก ระบบบันทึกประวัติการทำรายการ (Audit Logs) และระบบแจ้งเตือนภายในแอปพลิเคชัน (In-App Notification)</w:t>
-      </w:r>
-    </w:p>
-    <w:p>
-      <w:pPr>
-        <w:pStyle w:val="BodyText"/>
-      </w:pPr>
-      <w:r>
-        <w:t xml:space="preserve">1.3.6 โครงงานนี้ไม่ครอบคลุมระบบบัญชีเต็มรูปแบบ การชำระเงินผ่าน Payment Gateway หรือเครื่องรูดบัตร (EDC) ภายนอก การตรวจสอบสถานะการชำระเงินอัตโนมัติผ่าน API ของธนาคาร การพัฒนาแอปพลิเคชันแบบ Mobile Native การเชื่อมต่อระบบ ERP หรือซัพพลายเออร์ภายนอกแบบอัตโนมัติ และการแจ้งเตือนผ่านบริการภายนอก เช่น LINE Notify หรือ Email ส่วนโมดูล AI-Assisted ถือเป็น Future Work ที่ไม่อยู่ในขอบเขตของโครงงานนี้</w:t>
-      </w:r>
-    </w:p>
-    <w:bookmarkEnd w:id="12"/>
-    <w:bookmarkStart w:id="19" w:name="สมมตฐานของโครงงานวศวกรรม"/>
-    <w:p>
-      <w:pPr>
-        <w:pStyle w:val="Heading2"/>
-      </w:pPr>
-      <w:r>
-        <w:t xml:space="preserve">1.4 สมมติฐานของโครงงานวิศวกรรม</w:t>
-      </w:r>
-    </w:p>
-    <w:bookmarkStart w:id="13" w:name="X6c45b262d3e01ab68b3da831d7eb3bda5aa27c4"/>
-    <w:p>
-      <w:pPr>
-        <w:pStyle w:val="Heading3"/>
-      </w:pPr>
-      <w:r>
-        <w:t xml:space="preserve">1.4.1 สถาปัตยกรรมระบบแบบ 3 ชั้น (3-Tier Architecture)</w:t>
-      </w:r>
-    </w:p>
-    <w:p>
-      <w:pPr>
-        <w:pStyle w:val="FirstParagraph"/>
-      </w:pPr>
-      <w:r>
-        <w:t xml:space="preserve">1.4.1.1 ระบบถูกออกแบบแยกส่วนประกอบออกเป็น Presentation Layer, Application/Business Logic Layer และ Data Layer ตามหลักการแยกความรับผิดชอบ (Separation of Concerns)</w:t>
-      </w:r>
-    </w:p>
-    <w:p>
-      <w:pPr>
-        <w:pStyle w:val="BodyText"/>
-      </w:pPr>
-      <w:r>
-        <w:t xml:space="preserve">1.4.1.2 การแยกส่วนดังกล่าวช่วยให้การพัฒนา การทดสอบ และการบำรุงรักษาระบบในระยะยาวทำได้ง่ายและเป็นระบบมากขึ้น โดยทวนสอบได้จากการที่แต่ละส่วนประกอบสามารถทดสอบแยกจากกันได้โดยไม่ต้องเปิดระบบทั้งหมด</w:t>
-      </w:r>
-    </w:p>
-    <w:bookmarkEnd w:id="13"/>
-    <w:bookmarkStart w:id="14" w:name="ระบบฐานขอมลและคณสมบต-acid"/>
-    <w:p>
-      <w:pPr>
-        <w:pStyle w:val="Heading3"/>
-      </w:pPr>
-      <w:r>
-        <w:t xml:space="preserve">1.4.2 ระบบฐานข้อมูลและคุณสมบัติ ACID</w:t>
-      </w:r>
-    </w:p>
-    <w:p>
-      <w:pPr>
-        <w:pStyle w:val="FirstParagraph"/>
-      </w:pPr>
-      <w:r>
-        <w:t xml:space="preserve">1.4.2.1 ใช้ฐานข้อมูลเชิงสัมพันธ์ (MySQL) ควบคุมด้วยหลักการ ACID (Atomicity, Consistency, Isolation, Durability) เพื่อรับประกันความสมบูรณ์ของข้อมูลสต็อก</w:t>
-      </w:r>
-    </w:p>
-    <w:p>
-      <w:pPr>
-        <w:pStyle w:val="BodyText"/>
-      </w:pPr>
-      <w:r>
-        <w:t xml:space="preserve">1.4.2.2 ธุรกรรมการตัดสต็อกทำงานแบบอะตอมมิก (Atomic Transaction) เพื่อป้องกันภาวะ Race Condition เมื่อมีการยืนยันจ่ายสินค้าพร้อมกันหลายรายการ และเมื่อธุรกรรมล้มเหลวกลางคัน การเปลี่ยนแปลงที่ทำไปแล้วบางส่วนต้องถูกย้อนกลับทั้งหมด</w:t>
-      </w:r>
-    </w:p>
-    <w:bookmarkEnd w:id="14"/>
-    <w:bookmarkStart w:id="15" w:name="การควบคมสถานะคำสงซอ-order-status-control"/>
-    <w:p>
-      <w:pPr>
-        <w:pStyle w:val="Heading3"/>
-      </w:pPr>
-      <w:r>
-        <w:t xml:space="preserve">1.4.3 การควบคุมสถานะคำสั่งซื้อ (Order Status Control)</w:t>
-      </w:r>
-    </w:p>
-    <w:p>
-      <w:pPr>
-        <w:pStyle w:val="FirstParagraph"/>
-      </w:pPr>
-      <w:r>
-        <w:t xml:space="preserve">1.4.3.1 ระบบใช้แนวคิดการจัดการสถานะข้อมูล (State Management) กำกับวงจรชีวิตของคำสั่งซื้อ ตั้งแต่สถานะ</w:t>
-      </w:r>
-      <w:r>
-        <w:t xml:space="preserve"> </w:t>
-      </w:r>
-      <w:r>
-        <w:t xml:space="preserve">“รอจ่ายสินค้า”</w:t>
-      </w:r>
-      <w:r>
-        <w:t xml:space="preserve"> </w:t>
-      </w:r>
-      <w:r>
-        <w:t xml:space="preserve">จนถึง</w:t>
-      </w:r>
-      <w:r>
-        <w:t xml:space="preserve"> </w:t>
-      </w:r>
-      <w:r>
-        <w:t xml:space="preserve">“ส่งมอบสำเร็จ”</w:t>
-      </w:r>
-    </w:p>
-    <w:p>
-      <w:pPr>
-        <w:pStyle w:val="BodyText"/>
-      </w:pPr>
-      <w:r>
-        <w:t xml:space="preserve">1.4.3.2 เมื่อพนักงานคลังสินค้ากดยืนยันจ่ายสินค้าแล้ว ระบบจะเปลี่ยนสถานะคำสั่งซื้อทันที และไม่แสดงในคิวรอจ่ายอีกต่อไป เพื่อป้องกันการรับสินค้าซ้ำ โดยไม่ต้องอาศัยการสแกนรหัสยืนยันเพิ่มเติม</w:t>
-      </w:r>
-    </w:p>
-    <w:bookmarkEnd w:id="15"/>
-    <w:bookmarkStart w:id="16" w:name="X951687ef2c64f4ad26e3e661a119d01a9a60ae5"/>
-    <w:p>
-      <w:pPr>
-        <w:pStyle w:val="Heading3"/>
-      </w:pPr>
-      <w:r>
-        <w:t xml:space="preserve">1.4.4 การสื่อสารข้อมูลแบบเรียลไทม์ (Event-Driven Communication)</w:t>
-      </w:r>
-    </w:p>
-    <w:p>
-      <w:pPr>
-        <w:pStyle w:val="FirstParagraph"/>
-      </w:pPr>
-      <w:r>
-        <w:t xml:space="preserve">1.4.4.1 เมื่อมีการยืนยันคำสั่งซื้อที่หน้าร้าน ข้อมูลจะถูกผลัก (Push) ไปยังหน้าจอคิวคลังสินค้าทันที โดยพนักงานไม่จำเป็นต้องกดรีเฟรชหน้าจอ และไม่ต้องให้หน้าจอวนถามข้อมูลเป็นระยะ (Polling)</w:t>
-      </w:r>
-    </w:p>
-    <w:p>
-      <w:pPr>
-        <w:pStyle w:val="BodyText"/>
-      </w:pPr>
-      <w:r>
-        <w:t xml:space="preserve">1.4.4.2 พนักงานคลังสินค้าสามารถทราบและเริ่มจัดเตรียมสินค้าได้ก่อนที่ลูกค้าจะเดินถือใบเสร็จมาถึงจุดรับของ</w:t>
-      </w:r>
-    </w:p>
-    <w:bookmarkEnd w:id="16"/>
-    <w:bookmarkStart w:id="17" w:name="Xcf2c9c4bec6e1a4096a5f6228cbb22e5db80628"/>
-    <w:p>
-      <w:pPr>
-        <w:pStyle w:val="Heading3"/>
-      </w:pPr>
-      <w:r>
-        <w:t xml:space="preserve">1.4.5 การนำเสนอข้อมูลเชิงปฏิบัติการ (Operational Dashboard &amp; In-App Alerts)</w:t>
-      </w:r>
-    </w:p>
-    <w:p>
-      <w:pPr>
-        <w:pStyle w:val="FirstParagraph"/>
-      </w:pPr>
-      <w:r>
-        <w:t xml:space="preserve">1.4.5.1 ระบบรวบรวมข้อมูลธุรกรรม (Data Aggregation) จากหลายแหล่งมาแสดงผลผ่าน Operational Dashboard ให้ผู้บริหารมองเห็นภาพรวมแบบเรียลไทม์</w:t>
-      </w:r>
-    </w:p>
-    <w:p>
-      <w:pPr>
-        <w:pStyle w:val="BodyText"/>
-      </w:pPr>
-      <w:r>
-        <w:t xml:space="preserve">1.4.5.2 ระบบแจ้งเตือนภายในแอปพลิเคชัน (In-App Notification) เมื่อสต็อกต่ำกว่าจุดสั่งซื้อเพิ่ม (Reorder Point) หรือมีคิวงานค้างนานผิดปกติ โดยไม่พึ่งพาบริการแจ้งเตือนภายนอก</w:t>
-      </w:r>
-    </w:p>
-    <w:bookmarkEnd w:id="17"/>
-    <w:bookmarkStart w:id="18" w:name="ผลลพธทคาดหวงจากการนำระบบไปใช"/>
-    <w:p>
-      <w:pPr>
-        <w:pStyle w:val="Heading3"/>
-      </w:pPr>
-      <w:r>
-        <w:t xml:space="preserve">1.4.6 ผลลัพธ์ที่คาดหวังจากการนำระบบไปใช้</w:t>
-      </w:r>
-    </w:p>
-    <w:p>
-      <w:pPr>
-        <w:pStyle w:val="FirstParagraph"/>
-      </w:pPr>
-      <w:r>
-        <w:t xml:space="preserve">1.4.6.1 การส่งคำสั่งซื้อเข้าคิวงานคลังสินค้าแบบเรียลไทม์ทันทีที่ชำระเงิน จะช่วยลดข้อผิดพลาดในการหยิบสินค้า เนื่องจากพนักงานอ่านรายการจากหน้าจอที่ระบบสร้างขึ้นแทนการอ่านลายมือบนใบเสร็จ และทำให้กระบวนการส่งมอบรวดเร็วขึ้นเพราะการจัดเตรียมสินค้าเริ่มได้ก่อนลูกค้าเดินมาถึงจุดรับของ</w:t>
-      </w:r>
-    </w:p>
-    <w:p>
-      <w:pPr>
-        <w:pStyle w:val="BodyText"/>
-      </w:pPr>
-      <w:r>
-        <w:t xml:space="preserve">1.4.6.2 การให้พนักงานยืนยันจ่ายสินค้าผ่านหน้าจอคิวงานเพื่อตัดสต็อกอัตโนมัติ จะทำให้ตัวเลขสต็อกในระบบตรงกับจำนวนสินค้าที่มีอยู่จริงในคลัง โดยตั้งเกณฑ์ว่าต้องไม่เกิดผลต่างที่มีสาเหตุจากตัวระบบเอง ซึ่งทวนสอบได้ด้วยการนับสินค้าจริงเปรียบเทียบกับยอดในระบบ</w:t>
-      </w:r>
-    </w:p>
-    <w:p>
-      <w:pPr>
-        <w:pStyle w:val="BodyText"/>
-      </w:pPr>
-      <w:r>
-        <w:t xml:space="preserve">1.4.6.3 การใช้ Operational Dashboard และระบบแจ้งเตือนภายในแอปพลิเคชัน จะช่วยให้ผู้บริหารมีข้อมูลจริง (Data-Driven) ในการวางแผนสั่งซื้อสินค้า ลดปัญหาสินค้าขาดมือและสินค้าค้างสต็อกที่เกิดจากการสั่งซื้อด้วยประสบการณ์เพียงอย่างเดียว</w:t>
-      </w:r>
-    </w:p>
-    <w:bookmarkEnd w:id="18"/>
-    <w:bookmarkEnd w:id="19"/>
-    <w:bookmarkStart w:id="20" w:name="ประโยชนทคาดวาจะไดรบ"/>
-    <w:p>
-      <w:pPr>
-        <w:pStyle w:val="Heading2"/>
-      </w:pPr>
-      <w:r>
-        <w:t xml:space="preserve">1.5 ประโยชน์ที่คาดว่าจะได้รับ</w:t>
-      </w:r>
-    </w:p>
-    <w:p>
-      <w:pPr>
-        <w:pStyle w:val="FirstParagraph"/>
-      </w:pPr>
-      <w:r>
-        <w:t xml:space="preserve">1.5.1 ลดระยะเวลารอคอย (Lead Time Reduction) โดยลดคอขวดระหว่างหน้าร้านและคลังสินค้าผ่านระบบคิวเรียลไทม์ ทำให้คลังสินค้าสามารถจัดเตรียมวัสดุล่วงหน้าได้ทันทีที่รับชำระเงิน</w:t>
-      </w:r>
-    </w:p>
-    <w:p>
-      <w:pPr>
-        <w:pStyle w:val="BodyText"/>
-      </w:pPr>
-      <w:r>
-        <w:t xml:space="preserve">1.5.2 ลดข้อผิดพลาดที่เกิดจากมนุษย์ (Human Error Reduction) โดยลดความเสี่ยงจากการอ่านเอกสารกระดาษผิดพลาด ระบบส่งรายละเอียดคำสั่งซื้อไปยังหน้าจอคลังสินค้าโดยตรงแบบเรียลไทม์ พนักงานจึงเตรียมและตรวจสอบสินค้าจากข้อมูลบนหน้าจอระบบ แทนการอ่านใบเสร็จด้วยสายตาเพียงอย่างเดียว</w:t>
-      </w:r>
-    </w:p>
-    <w:p>
-      <w:pPr>
-        <w:pStyle w:val="BodyText"/>
-      </w:pPr>
-      <w:r>
-        <w:t xml:space="preserve">1.5.3 เพิ่มความสมบูรณ์ของข้อมูล (Data Integrity) โดยยอดสินค้าคงเหลือในระบบสะท้อนจำนวนสินค้าจริงในคลังอย่างแม่นยำ พร้อมทั้งสามารถตรวจสอบย้อนหลัง (Traceability) ได้ทุกรายการ ซึ่งเป็นรากฐานให้ผู้บริหารสามารถวางแผนสั่งซื้อสินค้าจากข้อมูลจริง แทนการใช้ประสบการณ์และสัญชาตญาณ</w:t>
-      </w:r>
-    </w:p>
-    <w:bookmarkEnd w:id="20"/>
-    <w:bookmarkStart w:id="21" w:name="สถานทจดทำโครงงาน"/>
-    <w:p>
-      <w:pPr>
-        <w:pStyle w:val="Heading2"/>
-      </w:pPr>
-      <w:r>
-        <w:t xml:space="preserve">1.6 สถานที่จัดทำโครงงาน</w:t>
-      </w:r>
-    </w:p>
-    <w:p>
-      <w:pPr>
-        <w:pStyle w:val="FirstParagraph"/>
-      </w:pPr>
-      <w:r>
-        <w:t xml:space="preserve">1.6.1 ร้านวัสดุก่อสร้างอำพรคอนกรีต ซึ่งเป็นสถานประกอบการที่ให้ความอนุเคราะห์เป็นพื้นที่ทดสอบนวัตกรรม (Sandbox) ของโครงงาน โดยแบ่งพื้นที่การทดสอบออกเป็น 3 ส่วน ได้แก่</w:t>
-      </w:r>
-    </w:p>
-    <w:p>
-      <w:pPr>
-        <w:pStyle w:val="BodyText"/>
-      </w:pPr>
-      <w:r>
-        <w:t xml:space="preserve">(1) พื้นที่หน้าร้าน (Storefront) สำหรับทดสอบระบบส่วนติดต่อพนักงานขาย (Sales UI) การสร้างคำสั่งซื้อ การแสดง QR พร้อมเพย์เพื่อรับชำระเงิน และความเสถียรของเครื่องพิมพ์ใบเสร็จ</w:t>
-      </w:r>
-    </w:p>
-    <w:p>
-      <w:pPr>
-        <w:pStyle w:val="BodyText"/>
-      </w:pPr>
-      <w:r>
-        <w:t xml:space="preserve">(2) พื้นที่คลังสินค้าและจุดจ่ายของ (Warehouse &amp; Loading Zone) สำหรับทดสอบระบบส่วนติดต่อพนักงานคลังสินค้า (Warehouse UI) การแสดงคิวงานเรียลไทม์ และการยืนยันจ่ายสินค้าพร้อมตัดยอดสินค้า</w:t>
-      </w:r>
-    </w:p>
-    <w:p>
-      <w:pPr>
-        <w:pStyle w:val="BodyText"/>
-      </w:pPr>
-      <w:r>
-        <w:t xml:space="preserve">(3) พื้นที่สำนักงาน (Back Office) สำหรับทดสอบการแสดงผลของ Operational Dashboard ความถูกต้องของระบบ Audit Logs และความเสถียรของระบบแจ้งเตือนภายในแอปพลิเคชันสำหรับผู้บริหาร</w:t>
-      </w:r>
-    </w:p>
-    <w:bookmarkEnd w:id="21"/>
-    <w:bookmarkStart w:id="22" w:name="ตารางแผนการดำเนนงาน"/>
-    <w:p>
-      <w:pPr>
-        <w:pStyle w:val="Heading2"/>
-      </w:pPr>
-      <w:r>
-        <w:t xml:space="preserve">1.7 ตารางแผนการดำเนินงาน</w:t>
+        <w:ind w:firstLine="1267"/>
+      </w:pPr>
+      <w:r>
+        <w:t xml:space="preserve">สิ่งที่อยู่ในขอบเขตและไม่อยู่ในขอบเขตของโครงงานแสดงดังตารางที่ 1.1</w:t>
       </w:r>
     </w:p>
     <w:p>
@@ -479,428 +197,289 @@
         <w:t xml:space="preserve"> </w:t>
       </w:r>
       <w:r>
-        <w:t xml:space="preserve">แผนการดำเนินงาน</w:t>
+        <w:t xml:space="preserve">สิ่งที่อยู่ในขอบเขตและไม่อยู่ในขอบเขตของโครงงาน</w:t>
       </w:r>
     </w:p>
     <w:tbl>
       <w:tblPr>
         <w:tblW w:w="5000" w:type="pct"/>
-        <w:tblLayout w:type="autofit"/>
         <w:tblStyle w:val="Table"/>
         <w:tblLook w:firstRow="1" w:lastRow="0" w:firstColumn="0" w:lastColumn="0" w:noHBand="0" w:noVBand="0" w:val="0020"/>
+        <w:tblLayout w:type="fixed"/>
       </w:tblPr>
+      <w:tblGrid>
+        <w:gridCol w:w="4655"/>
+        <w:gridCol w:w="3651"/>
+      </w:tblGrid>
       <w:tr>
         <w:trPr>
           <w:tblHeader w:val="on"/>
         </w:trPr>
         <w:tc>
-          <w:tcPr/>
-          <w:p>
-            <w:pPr>
-              <w:pStyle w:val="Compact"/>
-              <w:jc w:val="center"/>
-            </w:pPr>
-            <w:r>
-              <w:t xml:space="preserve">ลำดับ</w:t>
-            </w:r>
-          </w:p>
-        </w:tc>
-        <w:tc>
-          <w:tcPr/>
-          <w:p>
-            <w:pPr>
-              <w:pStyle w:val="Compact"/>
-            </w:pPr>
-            <w:r>
-              <w:t xml:space="preserve">กิจกรรมหลัก</w:t>
-            </w:r>
-          </w:p>
-        </w:tc>
-        <w:tc>
-          <w:tcPr/>
-          <w:p>
-            <w:pPr>
-              <w:pStyle w:val="Compact"/>
-            </w:pPr>
-            <w:r>
-              <w:t xml:space="preserve">รายละเอียดการดำเนินงาน</w:t>
-            </w:r>
-          </w:p>
-        </w:tc>
-        <w:tc>
-          <w:tcPr/>
-          <w:p>
-            <w:pPr>
-              <w:pStyle w:val="Compact"/>
-              <w:jc w:val="center"/>
-            </w:pPr>
-            <w:r>
-              <w:t xml:space="preserve">ช่วงเวลา</w:t>
-            </w:r>
-          </w:p>
-        </w:tc>
-        <w:tc>
-          <w:tcPr/>
-          <w:p>
-            <w:pPr>
-              <w:pStyle w:val="Compact"/>
-            </w:pPr>
-            <w:r>
-              <w:t xml:space="preserve">ผลลัพธ์ (Deliverables)</w:t>
+          <w:tcPr>
+            <w:tcW w:w="4655" w:type="dxa"/>
+          </w:tcPr>
+          <w:tcPr/>
+          <w:p>
+            <w:pPr>
+              <w:pStyle w:val="Compact"/>
+            </w:pPr>
+            <w:r>
+              <w:t xml:space="preserve">อยู่ในขอบเขต</w:t>
+            </w:r>
+          </w:p>
+        </w:tc>
+        <w:tc>
+          <w:tcPr>
+            <w:tcW w:w="3651" w:type="dxa"/>
+          </w:tcPr>
+          <w:tcPr/>
+          <w:p>
+            <w:pPr>
+              <w:pStyle w:val="Compact"/>
+            </w:pPr>
+            <w:r>
+              <w:t xml:space="preserve">ไม่อยู่ในขอบเขต</w:t>
             </w:r>
           </w:p>
         </w:tc>
       </w:tr>
       <w:tr>
         <w:tc>
-          <w:tcPr/>
-          <w:p>
-            <w:pPr>
-              <w:pStyle w:val="Compact"/>
-              <w:jc w:val="center"/>
-            </w:pPr>
-            <w:r>
-              <w:t xml:space="preserve">1</w:t>
-            </w:r>
-          </w:p>
-        </w:tc>
-        <w:tc>
-          <w:tcPr/>
-          <w:p>
-            <w:pPr>
-              <w:pStyle w:val="Compact"/>
-            </w:pPr>
-            <w:r>
-              <w:t xml:space="preserve">วิเคราะห์ความต้องการ (Requirements Analysis)</w:t>
-            </w:r>
-          </w:p>
-        </w:tc>
-        <w:tc>
-          <w:tcPr/>
-          <w:p>
-            <w:pPr>
-              <w:pStyle w:val="Compact"/>
-            </w:pPr>
-            <w:r>
-              <w:t xml:space="preserve">สำรวจปัญหา (Pain Points) หน้างาน สัมภาษณ์ผู้ใช้งาน กำหนด BR, FR, NFR และตกลงขอบเขตการทำงาน</w:t>
-            </w:r>
-          </w:p>
-        </w:tc>
-        <w:tc>
-          <w:tcPr/>
-          <w:p>
-            <w:pPr>
-              <w:pStyle w:val="Compact"/>
-              <w:jc w:val="center"/>
-            </w:pPr>
-            <w:r>
-              <w:t xml:space="preserve">เดือนที่ 1</w:t>
-            </w:r>
-          </w:p>
-        </w:tc>
-        <w:tc>
-          <w:tcPr/>
-          <w:p>
-            <w:pPr>
-              <w:pStyle w:val="Compact"/>
-            </w:pPr>
-            <w:r>
-              <w:t xml:space="preserve">เอกสารข้อกำหนดความต้องการ (SRS) และเอกสาร SE-02</w:t>
+          <w:tcPr>
+            <w:tcW w:w="4655" w:type="dxa"/>
+          </w:tcPr>
+          <w:tcPr/>
+          <w:p>
+            <w:pPr>
+              <w:pStyle w:val="Compact"/>
+            </w:pPr>
+            <w:r>
+              <w:t xml:space="preserve">ลงชื่อเข้าใช้งานและควบคุมสิทธิ์ตามบทบาท</w:t>
+            </w:r>
+          </w:p>
+        </w:tc>
+        <w:tc>
+          <w:tcPr>
+            <w:tcW w:w="3651" w:type="dxa"/>
+          </w:tcPr>
+          <w:tcPr/>
+          <w:p>
+            <w:pPr>
+              <w:pStyle w:val="Compact"/>
+            </w:pPr>
+            <w:r>
+              <w:t xml:space="preserve">ระบบบัญชีเต็มรูปแบบ</w:t>
             </w:r>
           </w:p>
         </w:tc>
       </w:tr>
       <w:tr>
         <w:tc>
-          <w:tcPr/>
-          <w:p>
-            <w:pPr>
-              <w:pStyle w:val="Compact"/>
-              <w:jc w:val="center"/>
-            </w:pPr>
-            <w:r>
-              <w:t xml:space="preserve">2</w:t>
-            </w:r>
-          </w:p>
-        </w:tc>
-        <w:tc>
-          <w:tcPr/>
-          <w:p>
-            <w:pPr>
-              <w:pStyle w:val="Compact"/>
-            </w:pPr>
-            <w:r>
-              <w:t xml:space="preserve">ออกแบบระบบ (System Design)</w:t>
-            </w:r>
-          </w:p>
-        </w:tc>
-        <w:tc>
-          <w:tcPr/>
-          <w:p>
-            <w:pPr>
-              <w:pStyle w:val="Compact"/>
-            </w:pPr>
-            <w:r>
-              <w:t xml:space="preserve">ออกแบบสถาปัตยกรรมระบบ (C1/C2/C3), กรณีการใช้งาน (Use Case), ฐานข้อมูล (ERD) และต้นแบบหน้าจอ (UI/UX)</w:t>
-            </w:r>
-          </w:p>
-        </w:tc>
-        <w:tc>
-          <w:tcPr/>
-          <w:p>
-            <w:pPr>
-              <w:pStyle w:val="Compact"/>
-              <w:jc w:val="center"/>
-            </w:pPr>
-            <w:r>
-              <w:t xml:space="preserve">เดือนที่ 2</w:t>
-            </w:r>
-          </w:p>
-        </w:tc>
-        <w:tc>
-          <w:tcPr/>
-          <w:p>
-            <w:pPr>
-              <w:pStyle w:val="Compact"/>
-            </w:pPr>
-            <w:r>
-              <w:t xml:space="preserve">เอกสารการออกแบบ (SDD) และต้นแบบหน้าจอ (Prototype)</w:t>
+          <w:tcPr>
+            <w:tcW w:w="4655" w:type="dxa"/>
+          </w:tcPr>
+          <w:tcPr/>
+          <w:p>
+            <w:pPr>
+              <w:pStyle w:val="Compact"/>
+            </w:pPr>
+            <w:r>
+              <w:t xml:space="preserve">จัดการข้อมูลสินค้าและตั้งจุดสั่งซื้อเพิ่ม</w:t>
+            </w:r>
+          </w:p>
+        </w:tc>
+        <w:tc>
+          <w:tcPr>
+            <w:tcW w:w="3651" w:type="dxa"/>
+          </w:tcPr>
+          <w:tcPr/>
+          <w:p>
+            <w:pPr>
+              <w:pStyle w:val="Compact"/>
+            </w:pPr>
+            <w:r>
+              <w:t xml:space="preserve">การชำระเงินผ่านเพย์เมนต์เกตเวย์หรือเครื่องรูดบัตร</w:t>
             </w:r>
           </w:p>
         </w:tc>
       </w:tr>
       <w:tr>
         <w:tc>
-          <w:tcPr/>
-          <w:p>
-            <w:pPr>
-              <w:pStyle w:val="Compact"/>
-              <w:jc w:val="center"/>
-            </w:pPr>
-            <w:r>
-              <w:t xml:space="preserve">3</w:t>
-            </w:r>
-          </w:p>
-        </w:tc>
-        <w:tc>
-          <w:tcPr/>
-          <w:p>
-            <w:pPr>
-              <w:pStyle w:val="Compact"/>
-            </w:pPr>
-            <w:r>
-              <w:t xml:space="preserve">พัฒนาโมดูลหลักระยะที่ 1 (Core Module I)</w:t>
-            </w:r>
-          </w:p>
-        </w:tc>
-        <w:tc>
-          <w:tcPr/>
-          <w:p>
-            <w:pPr>
-              <w:pStyle w:val="Compact"/>
-            </w:pPr>
-            <w:r>
-              <w:t xml:space="preserve">พัฒนาระบบ Login/RBAC, ฐานข้อมูลสินค้า (Product Master), ระบบคำสั่งซื้อหน้าร้าน, การสร้าง QR Code พร้อมเพย์สำหรับชำระเงิน และการเชื่อมต่อเครื่องพิมพ์ใบเสร็จ</w:t>
-            </w:r>
-          </w:p>
-        </w:tc>
-        <w:tc>
-          <w:tcPr/>
-          <w:p>
-            <w:pPr>
-              <w:pStyle w:val="Compact"/>
-              <w:jc w:val="center"/>
-            </w:pPr>
-            <w:r>
-              <w:t xml:space="preserve">เดือนที่ 3</w:t>
-            </w:r>
-          </w:p>
-        </w:tc>
-        <w:tc>
-          <w:tcPr/>
-          <w:p>
-            <w:pPr>
-              <w:pStyle w:val="Compact"/>
-            </w:pPr>
-            <w:r>
-              <w:t xml:space="preserve">ระบบต้นแบบระยะที่ 1 (Prototype Phase 1)</w:t>
+          <w:tcPr>
+            <w:tcW w:w="4655" w:type="dxa"/>
+          </w:tcPr>
+          <w:tcPr/>
+          <w:p>
+            <w:pPr>
+              <w:pStyle w:val="Compact"/>
+            </w:pPr>
+            <w:r>
+              <w:t xml:space="preserve">สร้างคำสั่งซื้อ แสดงรหัสคิวอาร์พร้อมเพย์ และพิมพ์ใบเสร็จด้วยเครื่องพิมพ์ใบเสร็จความร้อน</w:t>
+            </w:r>
+          </w:p>
+        </w:tc>
+        <w:tc>
+          <w:tcPr>
+            <w:tcW w:w="3651" w:type="dxa"/>
+          </w:tcPr>
+          <w:tcPr/>
+          <w:p>
+            <w:pPr>
+              <w:pStyle w:val="Compact"/>
+            </w:pPr>
+            <w:r>
+              <w:t xml:space="preserve">การตรวจสอบสถานะการชำระเงินอัตโนมัติผ่านบริการของธนาคาร</w:t>
             </w:r>
           </w:p>
         </w:tc>
       </w:tr>
       <w:tr>
         <w:tc>
-          <w:tcPr/>
-          <w:p>
-            <w:pPr>
-              <w:pStyle w:val="Compact"/>
-              <w:jc w:val="center"/>
-            </w:pPr>
-            <w:r>
-              <w:t xml:space="preserve">4</w:t>
-            </w:r>
-          </w:p>
-        </w:tc>
-        <w:tc>
-          <w:tcPr/>
-          <w:p>
-            <w:pPr>
-              <w:pStyle w:val="Compact"/>
-            </w:pPr>
-            <w:r>
-              <w:t xml:space="preserve">พัฒนาโมดูลหลักระยะที่ 2 (Core Module II)</w:t>
-            </w:r>
-          </w:p>
-        </w:tc>
-        <w:tc>
-          <w:tcPr/>
-          <w:p>
-            <w:pPr>
-              <w:pStyle w:val="Compact"/>
-            </w:pPr>
-            <w:r>
-              <w:t xml:space="preserve">พัฒนาระบบแสดงคิวคลังสินค้าแบบเรียลไทม์, ฟังก์ชันเลือกคำสั่งซื้อและยืนยันจ่ายสินค้า (Confirm Dispatch), ประวัติกิจกรรม (Audit Log) และแจ้งเตือน</w:t>
-            </w:r>
-          </w:p>
-        </w:tc>
-        <w:tc>
-          <w:tcPr/>
-          <w:p>
-            <w:pPr>
-              <w:pStyle w:val="Compact"/>
-              <w:jc w:val="center"/>
-            </w:pPr>
-            <w:r>
-              <w:t xml:space="preserve">เดือนที่ 4</w:t>
-            </w:r>
-          </w:p>
-        </w:tc>
-        <w:tc>
-          <w:tcPr/>
-          <w:p>
-            <w:pPr>
-              <w:pStyle w:val="Compact"/>
-            </w:pPr>
-            <w:r>
-              <w:t xml:space="preserve">ระบบต้นแบบระยะที่ 2 (Prototype Phase 2)</w:t>
+          <w:tcPr>
+            <w:tcW w:w="4655" w:type="dxa"/>
+          </w:tcPr>
+          <w:tcPr/>
+          <w:p>
+            <w:pPr>
+              <w:pStyle w:val="Compact"/>
+            </w:pPr>
+            <w:r>
+              <w:t xml:space="preserve">ส่งคำสั่งซื้อเข้าคิวคลังสินค้าแบบเรียลไทม์</w:t>
+            </w:r>
+          </w:p>
+        </w:tc>
+        <w:tc>
+          <w:tcPr>
+            <w:tcW w:w="3651" w:type="dxa"/>
+          </w:tcPr>
+          <w:tcPr/>
+          <w:p>
+            <w:pPr>
+              <w:pStyle w:val="Compact"/>
+            </w:pPr>
+            <w:r>
+              <w:t xml:space="preserve">แอปพลิเคชันแบบเนทีฟบนโทรศัพท์เคลื่อนที่</w:t>
             </w:r>
           </w:p>
         </w:tc>
       </w:tr>
       <w:tr>
         <w:tc>
-          <w:tcPr/>
-          <w:p>
-            <w:pPr>
-              <w:pStyle w:val="Compact"/>
-              <w:jc w:val="center"/>
-            </w:pPr>
-            <w:r>
-              <w:t xml:space="preserve">5</w:t>
-            </w:r>
-          </w:p>
-        </w:tc>
-        <w:tc>
-          <w:tcPr/>
-          <w:p>
-            <w:pPr>
-              <w:pStyle w:val="Compact"/>
-            </w:pPr>
-            <w:r>
-              <w:t xml:space="preserve">พัฒนา Dashboard และระบบแจ้งเตือน</w:t>
-            </w:r>
-          </w:p>
-        </w:tc>
-        <w:tc>
-          <w:tcPr/>
-          <w:p>
-            <w:pPr>
-              <w:pStyle w:val="Compact"/>
-            </w:pPr>
-            <w:r>
-              <w:t xml:space="preserve">พัฒนาหน้า Dashboard สำหรับผู้จัดการ รวมระบบแจ้งเตือนภายในแอปพลิเคชัน และตรวจสอบจุดสั่งซื้อเพิ่ม (Reorder Point)</w:t>
-            </w:r>
-          </w:p>
-        </w:tc>
-        <w:tc>
-          <w:tcPr/>
-          <w:p>
-            <w:pPr>
-              <w:pStyle w:val="Compact"/>
-              <w:jc w:val="center"/>
-            </w:pPr>
-            <w:r>
-              <w:t xml:space="preserve">เดือนที่ 5</w:t>
-            </w:r>
-          </w:p>
-        </w:tc>
-        <w:tc>
-          <w:tcPr/>
-          <w:p>
-            <w:pPr>
-              <w:pStyle w:val="Compact"/>
-            </w:pPr>
-            <w:r>
-              <w:t xml:space="preserve">ระบบเวอร์ชันสมบูรณ์ (Alpha Release)</w:t>
+          <w:tcPr>
+            <w:tcW w:w="4655" w:type="dxa"/>
+          </w:tcPr>
+          <w:tcPr/>
+          <w:p>
+            <w:pPr>
+              <w:pStyle w:val="Compact"/>
+            </w:pPr>
+            <w:r>
+              <w:t xml:space="preserve">ยืนยันจ่ายสินค้าพร้อมตัดสต็อกแบบอะตอมมิกและกันการจ่ายซ้ำ</w:t>
+            </w:r>
+          </w:p>
+        </w:tc>
+        <w:tc>
+          <w:tcPr>
+            <w:tcW w:w="3651" w:type="dxa"/>
+          </w:tcPr>
+          <w:tcPr/>
+          <w:p>
+            <w:pPr>
+              <w:pStyle w:val="Compact"/>
+            </w:pPr>
+            <w:r>
+              <w:t xml:space="preserve">การเชื่อมต่อระบบอีอาร์พีหรือซัพพลายเออร์ภายนอก</w:t>
             </w:r>
           </w:p>
         </w:tc>
       </w:tr>
       <w:tr>
         <w:tc>
-          <w:tcPr/>
-          <w:p>
-            <w:pPr>
-              <w:pStyle w:val="Compact"/>
-              <w:jc w:val="center"/>
-            </w:pPr>
-            <w:r>
-              <w:t xml:space="preserve">6</w:t>
-            </w:r>
-          </w:p>
-        </w:tc>
-        <w:tc>
-          <w:tcPr/>
-          <w:p>
-            <w:pPr>
-              <w:pStyle w:val="Compact"/>
-            </w:pPr>
-            <w:r>
-              <w:t xml:space="preserve">ทดสอบและประเมินผล (Testing &amp; Evaluation)</w:t>
-            </w:r>
-          </w:p>
-        </w:tc>
-        <w:tc>
-          <w:tcPr/>
-          <w:p>
-            <w:pPr>
-              <w:pStyle w:val="Compact"/>
-            </w:pPr>
-            <w:r>
-              <w:t xml:space="preserve">ทดสอบการทำงาน (Functional), ประสิทธิภาพ (Performance) และการยอมรับจากผู้ใช้จริง (UAT) พร้อมจัดทำรูปเล่ม</w:t>
-            </w:r>
-          </w:p>
-        </w:tc>
-        <w:tc>
-          <w:tcPr/>
-          <w:p>
-            <w:pPr>
-              <w:pStyle w:val="Compact"/>
-              <w:jc w:val="center"/>
-            </w:pPr>
-            <w:r>
-              <w:t xml:space="preserve">เดือนที่ 6</w:t>
-            </w:r>
-          </w:p>
-        </w:tc>
-        <w:tc>
-          <w:tcPr/>
-          <w:p>
-            <w:pPr>
-              <w:pStyle w:val="Compact"/>
-            </w:pPr>
-            <w:r>
-              <w:t xml:space="preserve">รายงานผลการทดสอบ (Test Report) และเล่มโครงงานฉบับสมบูรณ์</w:t>
+          <w:tcPr>
+            <w:tcW w:w="4655" w:type="dxa"/>
+          </w:tcPr>
+          <w:tcPr/>
+          <w:p>
+            <w:pPr>
+              <w:pStyle w:val="Compact"/>
+            </w:pPr>
+            <w:r>
+              <w:t xml:space="preserve">แดชบอร์ดปฏิบัติการและแดชบอร์ดระดับบริหาร</w:t>
+            </w:r>
+          </w:p>
+        </w:tc>
+        <w:tc>
+          <w:tcPr>
+            <w:tcW w:w="3651" w:type="dxa"/>
+          </w:tcPr>
+          <w:tcPr/>
+          <w:p>
+            <w:pPr>
+              <w:pStyle w:val="Compact"/>
+            </w:pPr>
+            <w:r>
+              <w:t xml:space="preserve">การแจ้งเตือนผ่านบริการภายนอก เช่น อีเมลหรือแอปพลิเคชันสนทนา</w:t>
+            </w:r>
+          </w:p>
+        </w:tc>
+      </w:tr>
+      <w:tr>
+        <w:tc>
+          <w:tcPr>
+            <w:tcW w:w="4655" w:type="dxa"/>
+          </w:tcPr>
+          <w:tcPr/>
+          <w:p>
+            <w:pPr>
+              <w:pStyle w:val="Compact"/>
+            </w:pPr>
+            <w:r>
+              <w:t xml:space="preserve">บันทึกและค้นหาประวัติการทำรายการ</w:t>
+            </w:r>
+          </w:p>
+        </w:tc>
+        <w:tc>
+          <w:tcPr>
+            <w:tcW w:w="3651" w:type="dxa"/>
+          </w:tcPr>
+          <w:tcPr/>
+          <w:p>
+            <w:pPr>
+              <w:pStyle w:val="Compact"/>
+            </w:pPr>
+            <w:r>
+              <w:t xml:space="preserve">ใบสั่งซื้อสินค้าจากซัพพลายเออร์</w:t>
+            </w:r>
+          </w:p>
+        </w:tc>
+      </w:tr>
+      <w:tr>
+        <w:tc>
+          <w:tcPr>
+            <w:tcW w:w="4655" w:type="dxa"/>
+          </w:tcPr>
+          <w:tcPr/>
+          <w:p>
+            <w:pPr>
+              <w:pStyle w:val="Compact"/>
+            </w:pPr>
+            <w:r>
+              <w:t xml:space="preserve">แจ้งเตือนภายในแอปพลิเคชันเมื่อสินค้าใกล้หมดและคิวค้าง</w:t>
+            </w:r>
+          </w:p>
+        </w:tc>
+        <w:tc>
+          <w:tcPr>
+            <w:tcW w:w="3651" w:type="dxa"/>
+          </w:tcPr>
+          <w:tcPr/>
+          <w:p>
+            <w:pPr>
+              <w:pStyle w:val="Compact"/>
+            </w:pPr>
+            <w:r>
+              <w:t xml:space="preserve">โมดูลปัญญาประดิษฐ์ช่วยวิเคราะห์</w:t>
             </w:r>
           </w:p>
         </w:tc>
@@ -909,13 +488,902 @@
     <w:p>
       <w:pPr>
         <w:pStyle w:val="BodyText"/>
-      </w:pPr>
-      <w:r>
-        <w:t xml:space="preserve">ตารางแผนการดำเนินงานนี้แสดงให้เห็นว่าโครงงานมีการวางแผนดำเนินงานอย่างเป็นขั้นตอน ตั้งแต่การวิเคราะห์ความต้องการจนถึงการทดสอบและประเมินผล ครอบคลุมระยะเวลารวม 6 เดือน ซึ่งช่วยให้ทีมงานสามารถติดตามความก้าวหน้าและควบคุมการทำงานของโครงงานได้อย่างมีระบบ</w:t>
-      </w:r>
-    </w:p>
+        <w:ind w:firstLine="1267"/>
+      </w:pPr>
+      <w:r>
+        <w:t xml:space="preserve">สิ่งที่อยู่ในขอบเขตทั้งแปดข้อในตารางที่ 1.1 คือที่มาของกรณีการใช้งาน UC-01 ถึง UC-11 ในบทที่ 3 การจับคู่ระหว่างขอบเขตกับกรณีการใช้งานแสดงไว้ในตารางที่ 3.13</w:t>
+      </w:r>
+    </w:p>
+    <w:bookmarkEnd w:id="14"/>
+    <w:bookmarkStart w:id="15" w:name="X9303fc4e8ba3a2bfd9b26f4af76f5b28b8db0f5"/>
+    <w:p>
+      <w:pPr>
+        <w:pStyle w:val="Heading3"/>
+      </w:pPr>
+      <w:r>
+        <w:t xml:space="preserve">1.3.2 ผู้ใช้เป้าหมาย แพลตฟอร์ม และเทคโนโลยีหลัก (Target Users, Platform and Technology)</w:t>
+      </w:r>
+    </w:p>
+    <w:p>
+      <w:pPr>
+        <w:pStyle w:val="FirstParagraph"/>
+        <w:ind w:firstLine="1267"/>
+      </w:pPr>
+      <w:r>
+        <w:t xml:space="preserve">ผู้ใช้เป้าหมายมีสามบทบาท ได้แก่ พนักงานขาย พนักงานคลังสินค้า และผู้จัดการ ระบบเป็นเว็บแอปพลิเคชันแบบเรสปอนซีฟดีไซน์ซึ่งปรับการแสดงผลตามขนาดหน้าจอ ใช้งานผ่านเบราว์เซอร์บนคอมพิวเตอร์หน้าร้านและบนโทรศัพท์เคลื่อนที่หรือแท็บเล็ตในคลัง ส่วนติดต่อผู้ใช้พัฒนาด้วยรีแอ็กต์ ระบบหลังบ้านพัฒนาด้วยโหนดเจเอสและเอ็กซ์เพรสเจเอส และฐานข้อมูลใช้มายเอสคิวแอล เหตุผลของการเลือกแต่ละเทคโนโลยีอธิบายไว้ในบทที่ 2 หัวข้อ 2.2</w:t>
+      </w:r>
+    </w:p>
+    <w:p>
+      <w:pPr>
+        <w:pStyle w:val="BodyText"/>
+        <w:ind w:firstLine="1267"/>
+      </w:pPr>
+      <w:r>
+        <w:t xml:space="preserve">สถานที่จัดทำและทดสอบโครงงานคือร้านวัสดุก่อสร้างอำพรคอนกรีต แบ่งเป็นสามพื้นที่ ได้แก่ พื้นที่หน้าร้านสำหรับทดสอบงานขายและเครื่องพิมพ์ใบเสร็จ พื้นที่คลังสินค้าสำหรับทดสอบคิวงานและการยืนยันจ่ายสินค้า และพื้นที่สำนักงานสำหรับทดสอบแดชบอร์ด ประวัติการทำรายการ และการแจ้งเตือน</w:t>
+      </w:r>
+    </w:p>
+    <w:bookmarkEnd w:id="15"/>
+    <w:bookmarkStart w:id="16" w:name="Xd0434664ef12d8cf493b754cd34249751df39d4"/>
+    <w:p>
+      <w:pPr>
+        <w:pStyle w:val="Heading3"/>
+      </w:pPr>
+      <w:r>
+        <w:t xml:space="preserve">1.3.3 ข้อจำกัดและข้อสมมติ (Constraints and Assumptions)</w:t>
+      </w:r>
+    </w:p>
+    <w:p>
+      <w:pPr>
+        <w:pStyle w:val="FirstParagraph"/>
+        <w:ind w:firstLine="1267"/>
+      </w:pPr>
+      <w:r>
+        <w:t xml:space="preserve">ข้อจำกัดของโครงงานมีห้าข้อ ข้อแรก ระบบไม่เชื่อมต่อกับธนาคาร จึงไม่ทราบเองว่าเงินเข้าบัญชีแล้วหรือไม่ ข้อที่สอง ร้านมีคอมพิวเตอร์ที่ต่อเครื่องพิมพ์ใบเสร็จเพียงเครื่องเดียว ทุกหน่วยติดตั้งจึงต้องทำงานบนเครื่องนั้น ข้อที่สาม ระบบทำงานในเครือข่ายภายในร้านผ่านการเชื่อมต่อแบบไม่เข้ารหัส ยังไม่ได้เปิดใช้เอชทีทีพีเอส ข้อที่สี่ ข้อมูลสินค้าตั้งต้นมาจากไฟล์ตารางคำนวณของร้าน ซึ่งระบุยอดคงเหลือไว้เพียงบางรายการ และข้อที่ห้า โครงงานมีผู้จัดทำสองคนและมีเวลา 6 เดือน</w:t>
+      </w:r>
+    </w:p>
+    <w:p>
+      <w:pPr>
+        <w:pStyle w:val="BodyText"/>
+        <w:ind w:firstLine="1267"/>
+      </w:pPr>
+      <w:r>
+        <w:t xml:space="preserve">ข้อสมมติของโครงงานมีสามข้อ ข้อแรก พนักงานขายตรวจการแจ้งเตือนเงินเข้าจากแอปพลิเคชันธนาคารก่อนกดยืนยันรับชำระทุกครั้ง ข้อที่สอง ร้านมีเครือข่ายไร้สายที่โทรศัพท์ของพนักงานคลังต่อเข้ากับคอมพิวเตอร์หน้าร้านได้ และข้อที่สาม ผู้ใช้มีบัญชีของตนเองและไม่ใช้บัญชีร่วมกัน เพราะประวัติการทำรายการระบุผู้กระทำจากบัญชีที่เข้าสู่ระบบ</w:t>
+      </w:r>
+    </w:p>
+    <w:bookmarkEnd w:id="16"/>
+    <w:bookmarkEnd w:id="17"/>
+    <w:bookmarkStart w:id="18" w:name="X43252d07c7e07af5916877322a0285ab52dcd26"/>
+    <w:p>
+      <w:pPr>
+        <w:pStyle w:val="Heading2"/>
+      </w:pPr>
+      <w:r>
+        <w:t xml:space="preserve">1.4 กระบวนการพัฒนาซอฟต์แวร์ที่เลือกใช้ (Software Process)</w:t>
+      </w:r>
+    </w:p>
+    <w:p>
+      <w:pPr>
+        <w:pStyle w:val="FirstParagraph"/>
+      </w:pPr>
+      <w:r>
+        <w:t xml:space="preserve">โครงงานนี้ใช้แบบจำลองน้ำตกที่ทวนกลับได้ คือทำงานเป็นระยะตามลำดับ ได้แก่ วิเคราะห์ความต้องการ ออกแบบ พัฒนา และทดสอบ แต่เปิดให้ย้อนกลับไปแก้ผลงานของระยะก่อนหน้าได้เมื่อพบข้อบกพร่องในระยะถัดมา [1] เหตุผลที่เลือกแบบจำลองนี้มีสามข้อ ข้อแรก ขอบเขตของระบบกำหนดได้ชัดตั้งแต่ต้นจากหลักฐานหน้างาน และร้านมีผู้ใช้จริงไม่กี่คน จึงไม่จำเป็นต้องใช้กระบวนการที่ปรับความต้องการบ่อยแบบสกรัม ข้อที่สอง โมดูลบางส่วนต้องพัฒนาตามลำดับ เพราะการยืนยันจ่ายสินค้าต้องใช้ข้อมูลคำสั่งซื้อที่เกิดจากงานขาย ข้อที่สาม ความเสี่ยงหลักของโครงงานอยู่ที่ความถูกต้องของข้อมูลเมื่อมีผู้ใช้พร้อมกัน ซึ่งต้องออกแบบให้ชัดก่อนพัฒนา</w:t>
+      </w:r>
+    </w:p>
+    <w:p>
+      <w:pPr>
+        <w:pStyle w:val="BodyText"/>
+      </w:pPr>
+      <w:r>
+        <w:t xml:space="preserve">การทวนกลับเกิดขึ้นจริงในโครงงานอย่างน้อยสองครั้ง ครั้งแรก การวัดภาระงานในระยะทดสอบพบธุรกรรมชนกันที่ขั้นตอนออกเลขที่คำสั่งซื้อ จึงย้อนกลับไปแก้ในระยะพัฒนา ครั้งที่สอง การติดตั้งบนเครื่องวินโดวส์ของร้านพบว่าส่งงานพิมพ์ไม่ได้ จึงย้อนกลับไปเพิ่มช่องทางพิมพ์สำหรับวินโดวส์ รายละเอียดทั้งสองเรื่องอยู่ในบทที่ 5 หัวข้อ 5.2</w:t>
+      </w:r>
+    </w:p>
+    <w:bookmarkEnd w:id="18"/>
+    <w:bookmarkStart w:id="22" w:name="แผนการดำเนนงานและระยะเวลา-project-plan"/>
+    <w:p>
+      <w:pPr>
+        <w:pStyle w:val="Heading2"/>
+      </w:pPr>
+      <w:r>
+        <w:t xml:space="preserve">1.5 แผนการดำเนินงานและระยะเวลา (Project Plan)</w:t>
+      </w:r>
+    </w:p>
+    <w:p>
+      <w:pPr>
+        <w:pStyle w:val="FirstParagraph"/>
+      </w:pPr>
+      <w:r>
+        <w:t xml:space="preserve">งานของโครงงานแบ่งเป็นหกกลุ่มงานตามระยะของกระบวนการในหัวข้อ 1.4 แต่ละกลุ่มงานมีผลลัพธ์ที่ส่งมอบเป็นหมุดหมาย ดังตารางที่ 1.2</w:t>
+      </w:r>
+    </w:p>
+    <w:p>
+      <w:pPr>
+        <w:pStyle w:val="TableCaption"/>
+      </w:pPr>
+      <w:r>
+        <w:rPr>
+          <w:b/>
+          <w:bCs/>
+        </w:rPr>
+        <w:t xml:space="preserve">ตารางที่ 1.2</w:t>
+      </w:r>
+      <w:r>
+        <w:t xml:space="preserve"> </w:t>
+      </w:r>
+      <w:r>
+        <w:t xml:space="preserve">โครงสร้างการแบ่งงานและหมุดหมายของโครงงาน</w:t>
+      </w:r>
+    </w:p>
+    <w:tbl>
+      <w:tblPr>
+        <w:tblW w:w="5000" w:type="pct"/>
+        <w:tblStyle w:val="Table"/>
+        <w:tblLook w:firstRow="1" w:lastRow="0" w:firstColumn="0" w:lastColumn="0" w:noHBand="0" w:noVBand="0" w:val="0020"/>
+        <w:tblLayout w:type="fixed"/>
+      </w:tblPr>
+      <w:tblGrid>
+        <w:gridCol w:w="672"/>
+        <w:gridCol w:w="1579"/>
+        <w:gridCol w:w="3310"/>
+        <w:gridCol w:w="981"/>
+        <w:gridCol w:w="1764"/>
+      </w:tblGrid>
+      <w:tr>
+        <w:trPr>
+          <w:tblHeader w:val="on"/>
+        </w:trPr>
+        <w:tc>
+          <w:tcPr>
+            <w:tcW w:w="672" w:type="dxa"/>
+          </w:tcPr>
+          <w:tcPr/>
+          <w:p>
+            <w:pPr>
+              <w:pStyle w:val="Compact"/>
+              <w:jc w:val="center"/>
+            </w:pPr>
+            <w:r>
+              <w:t xml:space="preserve">ลำดับ</w:t>
+            </w:r>
+          </w:p>
+        </w:tc>
+        <w:tc>
+          <w:tcPr>
+            <w:tcW w:w="1579" w:type="dxa"/>
+          </w:tcPr>
+          <w:tcPr/>
+          <w:p>
+            <w:pPr>
+              <w:pStyle w:val="Compact"/>
+            </w:pPr>
+            <w:r>
+              <w:t xml:space="preserve">กลุ่มงาน</w:t>
+            </w:r>
+          </w:p>
+        </w:tc>
+        <w:tc>
+          <w:tcPr>
+            <w:tcW w:w="3310" w:type="dxa"/>
+          </w:tcPr>
+          <w:tcPr/>
+          <w:p>
+            <w:pPr>
+              <w:pStyle w:val="Compact"/>
+            </w:pPr>
+            <w:r>
+              <w:t xml:space="preserve">รายละเอียดการดำเนินงาน</w:t>
+            </w:r>
+          </w:p>
+        </w:tc>
+        <w:tc>
+          <w:tcPr>
+            <w:tcW w:w="981" w:type="dxa"/>
+          </w:tcPr>
+          <w:tcPr/>
+          <w:p>
+            <w:pPr>
+              <w:pStyle w:val="Compact"/>
+              <w:jc w:val="center"/>
+            </w:pPr>
+            <w:r>
+              <w:t xml:space="preserve">ช่วงเวลา</w:t>
+            </w:r>
+          </w:p>
+        </w:tc>
+        <w:tc>
+          <w:tcPr>
+            <w:tcW w:w="1764" w:type="dxa"/>
+          </w:tcPr>
+          <w:tcPr/>
+          <w:p>
+            <w:pPr>
+              <w:pStyle w:val="Compact"/>
+            </w:pPr>
+            <w:r>
+              <w:t xml:space="preserve">หมุดหมาย</w:t>
+            </w:r>
+          </w:p>
+        </w:tc>
+      </w:tr>
+      <w:tr>
+        <w:tc>
+          <w:tcPr>
+            <w:tcW w:w="672" w:type="dxa"/>
+          </w:tcPr>
+          <w:tcPr/>
+          <w:p>
+            <w:pPr>
+              <w:pStyle w:val="Compact"/>
+              <w:jc w:val="center"/>
+            </w:pPr>
+            <w:r>
+              <w:t xml:space="preserve">1</w:t>
+            </w:r>
+          </w:p>
+        </w:tc>
+        <w:tc>
+          <w:tcPr>
+            <w:tcW w:w="1579" w:type="dxa"/>
+          </w:tcPr>
+          <w:tcPr/>
+          <w:p>
+            <w:pPr>
+              <w:pStyle w:val="Compact"/>
+            </w:pPr>
+            <w:r>
+              <w:t xml:space="preserve">วิเคราะห์ความต้องการ</w:t>
+            </w:r>
+          </w:p>
+        </w:tc>
+        <w:tc>
+          <w:tcPr>
+            <w:tcW w:w="3310" w:type="dxa"/>
+          </w:tcPr>
+          <w:tcPr/>
+          <w:p>
+            <w:pPr>
+              <w:pStyle w:val="Compact"/>
+            </w:pPr>
+            <w:r>
+              <w:t xml:space="preserve">สำรวจปัญหาหน้างาน สัมภาษณ์ผู้ใช้งาน กำหนดกฎทางธุรกิจ ความต้องการเชิงหน้าที่ และความต้องการนอกเหนือหน้าที่ และตกลงขอบเขตการทำงาน</w:t>
+            </w:r>
+          </w:p>
+        </w:tc>
+        <w:tc>
+          <w:tcPr>
+            <w:tcW w:w="981" w:type="dxa"/>
+          </w:tcPr>
+          <w:tcPr/>
+          <w:p>
+            <w:pPr>
+              <w:pStyle w:val="Compact"/>
+              <w:jc w:val="center"/>
+            </w:pPr>
+            <w:r>
+              <w:t xml:space="preserve">เดือนที่ 1</w:t>
+            </w:r>
+          </w:p>
+        </w:tc>
+        <w:tc>
+          <w:tcPr>
+            <w:tcW w:w="1764" w:type="dxa"/>
+          </w:tcPr>
+          <w:tcPr/>
+          <w:p>
+            <w:pPr>
+              <w:pStyle w:val="Compact"/>
+            </w:pPr>
+            <w:r>
+              <w:t xml:space="preserve">M1 เอกสารข้อกำหนดความต้องการ</w:t>
+            </w:r>
+          </w:p>
+        </w:tc>
+      </w:tr>
+      <w:tr>
+        <w:tc>
+          <w:tcPr>
+            <w:tcW w:w="672" w:type="dxa"/>
+          </w:tcPr>
+          <w:tcPr/>
+          <w:p>
+            <w:pPr>
+              <w:pStyle w:val="Compact"/>
+              <w:jc w:val="center"/>
+            </w:pPr>
+            <w:r>
+              <w:t xml:space="preserve">2</w:t>
+            </w:r>
+          </w:p>
+        </w:tc>
+        <w:tc>
+          <w:tcPr>
+            <w:tcW w:w="1579" w:type="dxa"/>
+          </w:tcPr>
+          <w:tcPr/>
+          <w:p>
+            <w:pPr>
+              <w:pStyle w:val="Compact"/>
+            </w:pPr>
+            <w:r>
+              <w:t xml:space="preserve">ออกแบบระบบ</w:t>
+            </w:r>
+          </w:p>
+        </w:tc>
+        <w:tc>
+          <w:tcPr>
+            <w:tcW w:w="3310" w:type="dxa"/>
+          </w:tcPr>
+          <w:tcPr/>
+          <w:p>
+            <w:pPr>
+              <w:pStyle w:val="Compact"/>
+            </w:pPr>
+            <w:r>
+              <w:t xml:space="preserve">ออกแบบสถาปัตยกรรมระดับ C1 C2 และ C3 กรณีการใช้งาน แผนภาพความสัมพันธ์ของฐานข้อมูล และต้นแบบหน้าจอ</w:t>
+            </w:r>
+          </w:p>
+        </w:tc>
+        <w:tc>
+          <w:tcPr>
+            <w:tcW w:w="981" w:type="dxa"/>
+          </w:tcPr>
+          <w:tcPr/>
+          <w:p>
+            <w:pPr>
+              <w:pStyle w:val="Compact"/>
+              <w:jc w:val="center"/>
+            </w:pPr>
+            <w:r>
+              <w:t xml:space="preserve">เดือนที่ 2</w:t>
+            </w:r>
+          </w:p>
+        </w:tc>
+        <w:tc>
+          <w:tcPr>
+            <w:tcW w:w="1764" w:type="dxa"/>
+          </w:tcPr>
+          <w:tcPr/>
+          <w:p>
+            <w:pPr>
+              <w:pStyle w:val="Compact"/>
+            </w:pPr>
+            <w:r>
+              <w:t xml:space="preserve">M2 เอกสารการออกแบบและต้นแบบหน้าจอ</w:t>
+            </w:r>
+          </w:p>
+        </w:tc>
+      </w:tr>
+      <w:tr>
+        <w:tc>
+          <w:tcPr>
+            <w:tcW w:w="672" w:type="dxa"/>
+          </w:tcPr>
+          <w:tcPr/>
+          <w:p>
+            <w:pPr>
+              <w:pStyle w:val="Compact"/>
+              <w:jc w:val="center"/>
+            </w:pPr>
+            <w:r>
+              <w:t xml:space="preserve">3</w:t>
+            </w:r>
+          </w:p>
+        </w:tc>
+        <w:tc>
+          <w:tcPr>
+            <w:tcW w:w="1579" w:type="dxa"/>
+          </w:tcPr>
+          <w:tcPr/>
+          <w:p>
+            <w:pPr>
+              <w:pStyle w:val="Compact"/>
+            </w:pPr>
+            <w:r>
+              <w:t xml:space="preserve">พัฒนาโมดูลหลักระยะที่ 1</w:t>
+            </w:r>
+          </w:p>
+        </w:tc>
+        <w:tc>
+          <w:tcPr>
+            <w:tcW w:w="3310" w:type="dxa"/>
+          </w:tcPr>
+          <w:tcPr/>
+          <w:p>
+            <w:pPr>
+              <w:pStyle w:val="Compact"/>
+            </w:pPr>
+            <w:r>
+              <w:t xml:space="preserve">พัฒนาการเข้าสู่ระบบและควบคุมสิทธิ์ ฐานข้อมูลสินค้า การสร้างคำสั่งซื้อ รหัสคิวอาร์พร้อมเพย์ และการเชื่อมต่อเครื่องพิมพ์ใบเสร็จ</w:t>
+            </w:r>
+          </w:p>
+        </w:tc>
+        <w:tc>
+          <w:tcPr>
+            <w:tcW w:w="981" w:type="dxa"/>
+          </w:tcPr>
+          <w:tcPr/>
+          <w:p>
+            <w:pPr>
+              <w:pStyle w:val="Compact"/>
+              <w:jc w:val="center"/>
+            </w:pPr>
+            <w:r>
+              <w:t xml:space="preserve">เดือนที่ 3</w:t>
+            </w:r>
+          </w:p>
+        </w:tc>
+        <w:tc>
+          <w:tcPr>
+            <w:tcW w:w="1764" w:type="dxa"/>
+          </w:tcPr>
+          <w:tcPr/>
+          <w:p>
+            <w:pPr>
+              <w:pStyle w:val="Compact"/>
+            </w:pPr>
+            <w:r>
+              <w:t xml:space="preserve">M3 ระบบต้นแบบระยะที่ 1</w:t>
+            </w:r>
+          </w:p>
+        </w:tc>
+      </w:tr>
+      <w:tr>
+        <w:tc>
+          <w:tcPr>
+            <w:tcW w:w="672" w:type="dxa"/>
+          </w:tcPr>
+          <w:tcPr/>
+          <w:p>
+            <w:pPr>
+              <w:pStyle w:val="Compact"/>
+              <w:jc w:val="center"/>
+            </w:pPr>
+            <w:r>
+              <w:t xml:space="preserve">4</w:t>
+            </w:r>
+          </w:p>
+        </w:tc>
+        <w:tc>
+          <w:tcPr>
+            <w:tcW w:w="1579" w:type="dxa"/>
+          </w:tcPr>
+          <w:tcPr/>
+          <w:p>
+            <w:pPr>
+              <w:pStyle w:val="Compact"/>
+            </w:pPr>
+            <w:r>
+              <w:t xml:space="preserve">พัฒนาโมดูลหลักระยะที่ 2</w:t>
+            </w:r>
+          </w:p>
+        </w:tc>
+        <w:tc>
+          <w:tcPr>
+            <w:tcW w:w="3310" w:type="dxa"/>
+          </w:tcPr>
+          <w:tcPr/>
+          <w:p>
+            <w:pPr>
+              <w:pStyle w:val="Compact"/>
+            </w:pPr>
+            <w:r>
+              <w:t xml:space="preserve">พัฒนาคิวคลังสินค้าแบบเรียลไทม์ การยืนยันจ่ายสินค้าและตัดสต็อก และประวัติการทำรายการ</w:t>
+            </w:r>
+          </w:p>
+        </w:tc>
+        <w:tc>
+          <w:tcPr>
+            <w:tcW w:w="981" w:type="dxa"/>
+          </w:tcPr>
+          <w:tcPr/>
+          <w:p>
+            <w:pPr>
+              <w:pStyle w:val="Compact"/>
+              <w:jc w:val="center"/>
+            </w:pPr>
+            <w:r>
+              <w:t xml:space="preserve">เดือนที่ 4</w:t>
+            </w:r>
+          </w:p>
+        </w:tc>
+        <w:tc>
+          <w:tcPr>
+            <w:tcW w:w="1764" w:type="dxa"/>
+          </w:tcPr>
+          <w:tcPr/>
+          <w:p>
+            <w:pPr>
+              <w:pStyle w:val="Compact"/>
+            </w:pPr>
+            <w:r>
+              <w:t xml:space="preserve">M4 ระบบต้นแบบระยะที่ 2</w:t>
+            </w:r>
+          </w:p>
+        </w:tc>
+      </w:tr>
+      <w:tr>
+        <w:tc>
+          <w:tcPr>
+            <w:tcW w:w="672" w:type="dxa"/>
+          </w:tcPr>
+          <w:tcPr/>
+          <w:p>
+            <w:pPr>
+              <w:pStyle w:val="Compact"/>
+              <w:jc w:val="center"/>
+            </w:pPr>
+            <w:r>
+              <w:t xml:space="preserve">5</w:t>
+            </w:r>
+          </w:p>
+        </w:tc>
+        <w:tc>
+          <w:tcPr>
+            <w:tcW w:w="1579" w:type="dxa"/>
+          </w:tcPr>
+          <w:tcPr/>
+          <w:p>
+            <w:pPr>
+              <w:pStyle w:val="Compact"/>
+            </w:pPr>
+            <w:r>
+              <w:t xml:space="preserve">พัฒนาแดชบอร์ดและการแจ้งเตือน</w:t>
+            </w:r>
+          </w:p>
+        </w:tc>
+        <w:tc>
+          <w:tcPr>
+            <w:tcW w:w="3310" w:type="dxa"/>
+          </w:tcPr>
+          <w:tcPr/>
+          <w:p>
+            <w:pPr>
+              <w:pStyle w:val="Compact"/>
+            </w:pPr>
+            <w:r>
+              <w:t xml:space="preserve">พัฒนาแดชบอร์ดสำหรับผู้จัดการ การแจ้งเตือนภายในแอปพลิเคชัน และการตรวจจุดสั่งซื้อเพิ่ม</w:t>
+            </w:r>
+          </w:p>
+        </w:tc>
+        <w:tc>
+          <w:tcPr>
+            <w:tcW w:w="981" w:type="dxa"/>
+          </w:tcPr>
+          <w:tcPr/>
+          <w:p>
+            <w:pPr>
+              <w:pStyle w:val="Compact"/>
+              <w:jc w:val="center"/>
+            </w:pPr>
+            <w:r>
+              <w:t xml:space="preserve">เดือนที่ 5</w:t>
+            </w:r>
+          </w:p>
+        </w:tc>
+        <w:tc>
+          <w:tcPr>
+            <w:tcW w:w="1764" w:type="dxa"/>
+          </w:tcPr>
+          <w:tcPr/>
+          <w:p>
+            <w:pPr>
+              <w:pStyle w:val="Compact"/>
+            </w:pPr>
+            <w:r>
+              <w:t xml:space="preserve">M5 ระบบรุ่นสมบูรณ์สำหรับทดสอบ</w:t>
+            </w:r>
+          </w:p>
+        </w:tc>
+      </w:tr>
+      <w:tr>
+        <w:tc>
+          <w:tcPr>
+            <w:tcW w:w="672" w:type="dxa"/>
+          </w:tcPr>
+          <w:tcPr/>
+          <w:p>
+            <w:pPr>
+              <w:pStyle w:val="Compact"/>
+              <w:jc w:val="center"/>
+            </w:pPr>
+            <w:r>
+              <w:t xml:space="preserve">6</w:t>
+            </w:r>
+          </w:p>
+        </w:tc>
+        <w:tc>
+          <w:tcPr>
+            <w:tcW w:w="1579" w:type="dxa"/>
+          </w:tcPr>
+          <w:tcPr/>
+          <w:p>
+            <w:pPr>
+              <w:pStyle w:val="Compact"/>
+            </w:pPr>
+            <w:r>
+              <w:t xml:space="preserve">ทดสอบและประเมินผล</w:t>
+            </w:r>
+          </w:p>
+        </w:tc>
+        <w:tc>
+          <w:tcPr>
+            <w:tcW w:w="3310" w:type="dxa"/>
+          </w:tcPr>
+          <w:tcPr/>
+          <w:p>
+            <w:pPr>
+              <w:pStyle w:val="Compact"/>
+            </w:pPr>
+            <w:r>
+              <w:t xml:space="preserve">ทดสอบการทำงาน ประสิทธิภาพ และการยอมรับจากผู้ใช้จริง พร้อมจัดทำรูปเล่ม</w:t>
+            </w:r>
+          </w:p>
+        </w:tc>
+        <w:tc>
+          <w:tcPr>
+            <w:tcW w:w="981" w:type="dxa"/>
+          </w:tcPr>
+          <w:tcPr/>
+          <w:p>
+            <w:pPr>
+              <w:pStyle w:val="Compact"/>
+              <w:jc w:val="center"/>
+            </w:pPr>
+            <w:r>
+              <w:t xml:space="preserve">เดือนที่ 6</w:t>
+            </w:r>
+          </w:p>
+        </w:tc>
+        <w:tc>
+          <w:tcPr>
+            <w:tcW w:w="1764" w:type="dxa"/>
+          </w:tcPr>
+          <w:tcPr/>
+          <w:p>
+            <w:pPr>
+              <w:pStyle w:val="Compact"/>
+            </w:pPr>
+            <w:r>
+              <w:t xml:space="preserve">M6 รายงานผลการทดสอบและเล่มฉบับสมบูรณ์</w:t>
+            </w:r>
+          </w:p>
+        </w:tc>
+      </w:tr>
+    </w:tbl>
+    <w:p>
+      <w:pPr>
+        <w:pStyle w:val="BodyText"/>
+      </w:pPr>
+      <w:r>
+        <w:t xml:space="preserve">ช่วงเวลาของแต่ละกลุ่มงานและหมุดหมาย M1 ถึง M6 ในตารางที่ 1.2 แสดงเป็นแผนภูมิแกนต์ดังรูปที่ 1.1</w:t>
+      </w:r>
+    </w:p>
+    <w:p>
+      <w:pPr>
+        <w:keepNext/>
+        <w:spacing w:before="240" w:after="120"/>
+        <w:ind w:left="0" w:right="0" w:firstLine="0"/>
+        <w:jc w:val="center"/>
+      </w:pPr>
+      <w:r>
+        <w:drawing>
+          <wp:inline>
+            <wp:extent cx="5274310" cy="1949895"/>
+            <wp:effectExtent b="0" l="0" r="0" t="0"/>
+            <wp:docPr descr="แผนภูมิแกนต์ของโครงงาน" title="" id="20" name="Picture"/>
+            <a:graphic>
+              <a:graphicData uri="http://schemas.openxmlformats.org/drawingml/2006/picture">
+                <pic:pic>
+                  <pic:nvPicPr>
+                    <pic:cNvPr descr="../assets/diagrams/fig1-gantt.png" id="21" name="Picture"/>
+                    <pic:cNvPicPr>
+                      <a:picLocks noChangeArrowheads="1" noChangeAspect="1"/>
+                    </pic:cNvPicPr>
+                  </pic:nvPicPr>
+                  <pic:blipFill>
+                    <a:blip r:embed="rId19"/>
+                    <a:stretch>
+                      <a:fillRect/>
+                    </a:stretch>
+                  </pic:blipFill>
+                  <pic:spPr bwMode="auto">
+                    <a:xfrm>
+                      <a:off x="0" y="0"/>
+                      <a:ext cx="5274310" cy="1949895"/>
+                    </a:xfrm>
+                    <a:prstGeom prst="rect">
+                      <a:avLst/>
+                    </a:prstGeom>
+                    <a:noFill/>
+                    <a:ln w="9525">
+                      <a:noFill/>
+                      <a:headEnd/>
+                      <a:tailEnd/>
+                    </a:ln>
+                  </pic:spPr>
+                </pic:pic>
+              </a:graphicData>
+            </a:graphic>
+          </wp:inline>
+        </w:drawing>
+      </w:r>
+    </w:p>
+    <w:p>
+      <w:pPr>
+        <w:pStyle w:val="ImageCaption"/>
+      </w:pPr>
+      <w:r>
+        <w:rPr>
+          <w:b/>
+          <w:bCs/>
+        </w:rPr>
+        <w:t xml:space="preserve">รูปที่ 1.1</w:t>
+      </w:r>
+      <w:r>
+        <w:t xml:space="preserve"> </w:t>
+      </w:r>
+      <w:r>
+        <w:t xml:space="preserve">แผนภูมิแกนต์ของแผนการดำเนินงาน (Gantt Chart)</w:t>
+      </w:r>
+    </w:p>
+    <w:p>
+      <w:pPr>
+        <w:pStyle w:val="BodyText"/>
+      </w:pPr>
+      <w:r>
+        <w:t xml:space="preserve">ผู้จัดทำโครงงานมีสองคน แบ่งความรับผิดชอบหลักตามหน่วยของระบบดังตารางที่ 1.3 ส่วนงานวิเคราะห์ความต้องการ การทดสอบ และการจัดทำรูปเล่ม ทำร่วมกันทั้งสองคน</w:t>
+      </w:r>
+    </w:p>
+    <w:p>
+      <w:pPr>
+        <w:pStyle w:val="TableCaption"/>
+      </w:pPr>
+      <w:r>
+        <w:rPr>
+          <w:b/>
+          <w:bCs/>
+        </w:rPr>
+        <w:t xml:space="preserve">ตารางที่ 1.3</w:t>
+      </w:r>
+      <w:r>
+        <w:t xml:space="preserve"> </w:t>
+      </w:r>
+      <w:r>
+        <w:t xml:space="preserve">การแบ่งบทบาทในทีม</w:t>
+      </w:r>
+    </w:p>
+    <w:tbl>
+      <w:tblPr>
+        <w:tblW w:w="5000" w:type="pct"/>
+        <w:tblStyle w:val="Table"/>
+        <w:tblLook w:firstRow="1" w:lastRow="0" w:firstColumn="0" w:lastColumn="0" w:noHBand="0" w:noVBand="0" w:val="0020"/>
+        <w:tblLayout w:type="fixed"/>
+      </w:tblPr>
+      <w:tblGrid>
+        <w:gridCol w:w="1710"/>
+        <w:gridCol w:w="6596"/>
+      </w:tblGrid>
+      <w:tr>
+        <w:trPr>
+          <w:tblHeader w:val="on"/>
+        </w:trPr>
+        <w:tc>
+          <w:tcPr>
+            <w:tcW w:w="1710" w:type="dxa"/>
+          </w:tcPr>
+          <w:tcPr/>
+          <w:p>
+            <w:pPr>
+              <w:pStyle w:val="Compact"/>
+            </w:pPr>
+            <w:r>
+              <w:t xml:space="preserve">ผู้จัดทำ</w:t>
+            </w:r>
+          </w:p>
+        </w:tc>
+        <w:tc>
+          <w:tcPr>
+            <w:tcW w:w="6596" w:type="dxa"/>
+          </w:tcPr>
+          <w:tcPr/>
+          <w:p>
+            <w:pPr>
+              <w:pStyle w:val="Compact"/>
+            </w:pPr>
+            <w:r>
+              <w:t xml:space="preserve">ความรับผิดชอบหลัก</w:t>
+            </w:r>
+          </w:p>
+        </w:tc>
+      </w:tr>
+      <w:tr>
+        <w:tc>
+          <w:tcPr>
+            <w:tcW w:w="1710" w:type="dxa"/>
+          </w:tcPr>
+          <w:tcPr/>
+          <w:p>
+            <w:pPr>
+              <w:pStyle w:val="Compact"/>
+            </w:pPr>
+            <w:r>
+              <w:t xml:space="preserve">นายตรัยรัตน์ วงษ์สิทธิ์</w:t>
+            </w:r>
+          </w:p>
+        </w:tc>
+        <w:tc>
+          <w:tcPr>
+            <w:tcW w:w="6596" w:type="dxa"/>
+          </w:tcPr>
+          <w:tcPr/>
+          <w:p>
+            <w:pPr>
+              <w:pStyle w:val="Compact"/>
+            </w:pPr>
+            <w:r>
+              <w:t xml:space="preserve">ระบบหลังบ้าน โมดูล BE-01 ถึง BE-10 ส่วนสนับสนุน SP-01 ถึง SP-03 ฐานข้อมูล และบริการพิมพ์ใบเสร็จ</w:t>
+            </w:r>
+          </w:p>
+        </w:tc>
+      </w:tr>
+      <w:tr>
+        <w:tc>
+          <w:tcPr>
+            <w:tcW w:w="1710" w:type="dxa"/>
+          </w:tcPr>
+          <w:tcPr/>
+          <w:p>
+            <w:pPr>
+              <w:pStyle w:val="Compact"/>
+            </w:pPr>
+            <w:r>
+              <w:t xml:space="preserve">นายพนาวุฒน์ อภิปสันติ</w:t>
+            </w:r>
+          </w:p>
+        </w:tc>
+        <w:tc>
+          <w:tcPr>
+            <w:tcW w:w="6596" w:type="dxa"/>
+          </w:tcPr>
+          <w:tcPr/>
+          <w:p>
+            <w:pPr>
+              <w:pStyle w:val="Compact"/>
+            </w:pPr>
+            <w:r>
+              <w:t xml:space="preserve">ส่วนติดต่อผู้ใช้ หน้าจอ FE-01 ถึง FE-09 และการแสดงผลบนอุปกรณ์เคลื่อนที่</w:t>
+            </w:r>
+          </w:p>
+        </w:tc>
+      </w:tr>
+    </w:tbl>
     <w:bookmarkEnd w:id="22"/>
+    <w:bookmarkStart w:id="23" w:name="ประโยชนทคาดวาจะไดรบ-expected-benefits"/>
+    <w:p>
+      <w:pPr>
+        <w:pStyle w:val="Heading2"/>
+      </w:pPr>
+      <w:r>
+        <w:t xml:space="preserve">1.6 ประโยชน์ที่คาดว่าจะได้รับ (Expected Benefits)</w:t>
+      </w:r>
+    </w:p>
+    <w:p>
+      <w:pPr>
+        <w:pStyle w:val="FirstParagraph"/>
+      </w:pPr>
+      <w:r>
+        <w:t xml:space="preserve">ประโยชน์ต่อผู้ใช้และร้านมีสามข้อ ข้อแรก ลดระยะเวลารอคอยของลูกค้า เพราะคลังเริ่มจัดของได้ทันทีที่รับชำระเงิน ตอบวัตถุประสงค์ข้อ 2 ข้อที่สอง ลดข้อผิดพลาดที่เกิดจากมนุษย์ เพราะพนักงานคลังอ่านรายการจากหน้าจอที่ระบบสร้างแทนการอ่านลายมือบนบิล และระบบไม่ยอมให้จ่ายของซ้ำจากใบเดิม ตอบวัตถุประสงค์ข้อ 1 และข้อ 3 ข้อที่สาม ผู้จัดการวางแผนสั่งซื้อสินค้าจากข้อมูลจริงที่ตรวจสอบย้อนหลังได้ทุกรายการ ลดปัญหาสินค้าขาดมือและสินค้าค้างสต็อก ตอบวัตถุประสงค์ข้อ 4</w:t>
+      </w:r>
+    </w:p>
+    <w:p>
+      <w:pPr>
+        <w:pStyle w:val="BodyText"/>
+      </w:pPr>
+      <w:r>
+        <w:t xml:space="preserve">ประโยชน์เชิงวิชาชีพคือผู้จัดทำได้ฝึกกระบวนการวิศวกรรมซอฟต์แวร์ครบวงจรกับปัญหาจริงของสถานประกอบการ ตั้งแต่การเก็บความต้องการจนถึงการติดตั้งใช้งาน ตอบวัตถุประสงค์ข้อ 5 และข้อ 6</w:t>
+      </w:r>
+    </w:p>
     <w:bookmarkEnd w:id="23"/>
+    <w:bookmarkEnd w:id="24"/>
     <w:sectPr>
       <w:headerReference r:id="rIdHdrNum" w:type="default"/>
       <w:headerReference r:id="rIdHdrFirst" w:type="first"/>
@@ -1525,14 +1993,6 @@
     <w:basedOn w:val="DefaultParagraphFont"/>
     <w:link w:val="BodyText"/>
   </w:style>
-  <w:style w:customStyle="1" w:styleId="VerbatimChar" w:type="character">
-    <w:name w:val="Verbatim Char"/>
-    <w:basedOn w:val="BodyTextChar"/>
-    <w:rPr>
-      <w:rFonts w:ascii="Consolas" w:hAnsi="Consolas"/>
-      <w:sz w:val="22"/>
-    </w:rPr>
-  </w:style>
   <w:style w:customStyle="1" w:styleId="SectionNumber" w:type="character">
     <w:name w:val="Section Number"/>
     <w:basedOn w:val="BodyTextChar"/>
@@ -1671,14 +2131,10 @@
     <w:pPr>
       <w:keepNext/>
       <w:jc w:val="left"/>
-      <w:ind w:firstLine="0" w:left="1440"/>
+      <w:ind w:firstLine="0" w:left="1267"/>
       <w:spacing w:after="120" w:before="240"/>
       <w:outlineLvl w:val="3"/>
     </w:pPr>
-    <w:rPr>
-      <w:b/>
-      <w:bCs/>
-    </w:rPr>
   </w:style>
   <w:style w:styleId="Heading5" w:type="paragraph">
     <w:name w:val="heading 5"/>
@@ -1687,14 +2143,10 @@
     <w:pPr>
       <w:keepNext/>
       <w:jc w:val="left"/>
-      <w:ind w:firstLine="0" w:left="2160"/>
+      <w:ind w:firstLine="0" w:left="1973"/>
       <w:spacing w:after="120" w:before="240"/>
       <w:outlineLvl w:val="4"/>
     </w:pPr>
-    <w:rPr>
-      <w:b/>
-      <w:bCs/>
-    </w:rPr>
   </w:style>
   <w:style w:styleId="TableCaption" w:type="paragraph">
     <w:name w:val="Table Caption"/>
@@ -1716,6 +2168,36 @@
       <w:ind w:firstLine="0"/>
       <w:spacing w:after="240"/>
     </w:pPr>
+  </w:style>
+  <w:style w:styleId="ImageSource" w:type="paragraph">
+    <w:name w:val="Image Source"/>
+    <w:basedOn w:val="Normal"/>
+    <w:qFormat/>
+    <w:pPr>
+      <w:jc w:val="center"/>
+      <w:ind w:firstLine="0"/>
+      <w:spacing w:after="240"/>
+    </w:pPr>
+  </w:style>
+  <w:style w:customStyle="1" w:styleId="SourceCode" w:type="paragraph">
+    <w:name w:val="Source Code"/>
+    <w:basedOn w:val="Normal"/>
+    <w:link w:val="VerbatimChar"/>
+    <w:pPr>
+      <w:shd w:color="auto" w:fill="F2F2F2" w:val="clear"/>
+      <w:spacing w:after="240" w:before="120" w:line="240" w:lineRule="auto"/>
+      <w:ind w:firstLine="0" w:left="0"/>
+      <w:jc w:val="left"/>
+    </w:pPr>
+  </w:style>
+  <w:style w:customStyle="1" w:styleId="VerbatimChar" w:type="character">
+    <w:name w:val="Verbatim Char"/>
+    <w:link w:val="SourceCode"/>
+    <w:rPr>
+      <w:rFonts w:ascii="Courier New" w:cs="TH Sarabun New" w:eastAsia="Courier New" w:hAnsi="Courier New"/>
+      <w:sz w:val="18"/>
+      <w:szCs w:val="26"/>
+    </w:rPr>
   </w:style>
   <w:style w:styleId="Table" w:type="table">
     <w:name w:val="Table"/>
@@ -1745,14 +2227,6 @@
         <w:bCs/>
       </w:rPr>
     </w:tblStylePr>
-  </w:style>
-  <w:style w:type="paragraph" w:customStyle="1" w:styleId="SourceCode">
-    <w:name w:val="Source Code"/>
-    <w:basedOn w:val="Normal"/>
-    <w:link w:val="VerbatimChar"/>
-    <w:pPr>
-      <w:wordWrap w:val="off"/>
-    </w:pPr>
   </w:style>
   <w:style w:type="character" w:customStyle="1" w:styleId="KeywordTok">
     <w:name w:val="KeywordTok"/>

</xml_diff>